<commit_message>
Add Phase 6D: structural novelty analysis via Tanimoto similarity
Compares top-50 predicted actives against a 20-antibiotic reference panel
using ECFP4 Tanimoto similarity. Results: 43/50 structurally novel, 7/50
related scaffold, 0 rediscoveries; 11 of 15 true actives are novel.
</commit_message>
<xml_diff>
--- a/Phase 6/Report Phase 6.docx
+++ b/Phase 6/Report Phase 6.docx
@@ -7401,6 +7401,2799 @@
     </w:p>
     <w:p>
       <w:pPr>
+        <w:spacing w:before="280" w:after="80"/>
+        <w:pBdr>
+          <w:bottom w:val="single" w:sz="6" w:space="1" w:color="2E75B6"/>
+        </w:pBdr>
+      </w:pPr>
+      <w:r>
+        <w:rPr>
+          <w:rFonts w:ascii="Arial" w:hAnsi="Arial"/>
+          <w:b/>
+          <w:i w:val="0"/>
+          <w:color w:val="2E75B6"/>
+          <w:sz w:val="28"/>
+        </w:rPr>
+        <w:t>9. Step 5 (6D) — Structural Novelty Analysis</w:t>
+      </w:r>
+    </w:p>
+    <w:p>
+      <w:pPr>
+        <w:spacing w:before="200" w:after="60"/>
+      </w:pPr>
+      <w:r>
+        <w:rPr>
+          <w:rFonts w:ascii="Arial" w:hAnsi="Arial"/>
+          <w:b/>
+          <w:i w:val="0"/>
+          <w:color w:val="1F4E79"/>
+          <w:sz w:val="24"/>
+        </w:rPr>
+        <w:t>9.1 Approach</w:t>
+      </w:r>
+    </w:p>
+    <w:p>
+      <w:pPr>
+        <w:spacing w:after="120"/>
+      </w:pPr>
+      <w:r>
+        <w:rPr>
+          <w:rFonts w:ascii="Arial" w:hAnsi="Arial"/>
+          <w:b w:val="0"/>
+          <w:i w:val="0"/>
+          <w:sz w:val="21"/>
+        </w:rPr>
+        <w:t>Tanimoto similarity (Morgan fingerprints, radius=2, 2048 bits) was computed between each of the top 50 model predictions and a reference panel of 19 known antibiotics covering all major classes: beta-lactams (Ampicillin, Amoxicillin, Piperacillin, Meropenem), fluoroquinolones (Ciprofloxacin, Levofloxacin, Norfloxacin), macrolides (Erythromycin, Azithromycin), aminoglycosides (Gentamicin, Streptomycin), glycopeptides (Vancomycin), sulfonamides (Trimethoprim, Sulfamethoxazole), polymyxins (Colistin), and others (Chloramphenicol, Rifampicin, Linezolid, Halicin). Tetracycline and Doxycycline were excluded due to SMILES parsing failures from complex stereochemistry.</w:t>
+      </w:r>
+    </w:p>
+    <w:p>
+      <w:pPr>
+        <w:spacing w:after="120"/>
+      </w:pPr>
+      <w:r>
+        <w:rPr>
+          <w:rFonts w:ascii="Arial" w:hAnsi="Arial"/>
+          <w:b w:val="0"/>
+          <w:i w:val="0"/>
+          <w:sz w:val="21"/>
+        </w:rPr>
+        <w:t>Each compound was classified based on its maximum Tanimoto similarity to any reference antibiotic:</w:t>
+      </w:r>
+    </w:p>
+    <w:tbl>
+      <w:tblPr>
+        <w:tblStyle w:val="TableGrid"/>
+        <w:tblW w:type="auto" w:w="0"/>
+        <w:jc w:val="left"/>
+        <w:tblLook w:firstColumn="1" w:firstRow="1" w:lastColumn="0" w:lastRow="0" w:noHBand="0" w:noVBand="1" w:val="04A0"/>
+      </w:tblPr>
+      <w:tblGrid>
+        <w:gridCol w:w="3120"/>
+        <w:gridCol w:w="3120"/>
+        <w:gridCol w:w="3120"/>
+      </w:tblGrid>
+      <w:tr>
+        <w:tc>
+          <w:tcPr>
+            <w:tcW w:type="dxa" w:w="2268"/>
+            <w:shd w:val="clear" w:color="auto" w:fill="2E75B6"/>
+            <w:tcBorders>
+              <w:top w:val="single" w:sz="4" w:space="0" w:color="AAAAAA"/>
+              <w:left w:val="single" w:sz="4" w:space="0" w:color="AAAAAA"/>
+              <w:bottom w:val="single" w:sz="4" w:space="0" w:color="AAAAAA"/>
+              <w:right w:val="single" w:sz="4" w:space="0" w:color="AAAAAA"/>
+            </w:tcBorders>
+            <w:tcMar>
+              <w:top w:w="80" w:type="dxa"/>
+              <w:left w:w="80" w:type="dxa"/>
+              <w:bottom w:w="80" w:type="dxa"/>
+              <w:right w:w="80" w:type="dxa"/>
+            </w:tcMar>
+          </w:tcPr>
+          <w:p>
+            <w:r>
+              <w:rPr>
+                <w:rFonts w:ascii="Arial" w:hAnsi="Arial"/>
+                <w:b/>
+                <w:i w:val="0"/>
+                <w:color w:val="FFFFFF"/>
+                <w:sz w:val="20"/>
+              </w:rPr>
+              <w:t>Category</w:t>
+            </w:r>
+          </w:p>
+        </w:tc>
+        <w:tc>
+          <w:tcPr>
+            <w:tcW w:type="dxa" w:w="2551"/>
+            <w:shd w:val="clear" w:color="auto" w:fill="2E75B6"/>
+            <w:tcBorders>
+              <w:top w:val="single" w:sz="4" w:space="0" w:color="AAAAAA"/>
+              <w:left w:val="single" w:sz="4" w:space="0" w:color="AAAAAA"/>
+              <w:bottom w:val="single" w:sz="4" w:space="0" w:color="AAAAAA"/>
+              <w:right w:val="single" w:sz="4" w:space="0" w:color="AAAAAA"/>
+            </w:tcBorders>
+            <w:tcMar>
+              <w:top w:w="80" w:type="dxa"/>
+              <w:left w:w="80" w:type="dxa"/>
+              <w:bottom w:w="80" w:type="dxa"/>
+              <w:right w:w="80" w:type="dxa"/>
+            </w:tcMar>
+          </w:tcPr>
+          <w:p>
+            <w:r>
+              <w:rPr>
+                <w:rFonts w:ascii="Arial" w:hAnsi="Arial"/>
+                <w:b/>
+                <w:i w:val="0"/>
+                <w:color w:val="FFFFFF"/>
+                <w:sz w:val="20"/>
+              </w:rPr>
+              <w:t>Threshold</w:t>
+            </w:r>
+          </w:p>
+        </w:tc>
+        <w:tc>
+          <w:tcPr>
+            <w:tcW w:type="dxa" w:w="4252"/>
+            <w:shd w:val="clear" w:color="auto" w:fill="2E75B6"/>
+            <w:tcBorders>
+              <w:top w:val="single" w:sz="4" w:space="0" w:color="AAAAAA"/>
+              <w:left w:val="single" w:sz="4" w:space="0" w:color="AAAAAA"/>
+              <w:bottom w:val="single" w:sz="4" w:space="0" w:color="AAAAAA"/>
+              <w:right w:val="single" w:sz="4" w:space="0" w:color="AAAAAA"/>
+            </w:tcBorders>
+            <w:tcMar>
+              <w:top w:w="80" w:type="dxa"/>
+              <w:left w:w="80" w:type="dxa"/>
+              <w:bottom w:w="80" w:type="dxa"/>
+              <w:right w:w="80" w:type="dxa"/>
+            </w:tcMar>
+          </w:tcPr>
+          <w:p>
+            <w:r>
+              <w:rPr>
+                <w:rFonts w:ascii="Arial" w:hAnsi="Arial"/>
+                <w:b/>
+                <w:i w:val="0"/>
+                <w:color w:val="FFFFFF"/>
+                <w:sz w:val="20"/>
+              </w:rPr>
+              <w:t>Meaning</w:t>
+            </w:r>
+          </w:p>
+        </w:tc>
+      </w:tr>
+      <w:tr>
+        <w:tc>
+          <w:tcPr>
+            <w:tcW w:type="dxa" w:w="2268"/>
+            <w:shd w:val="clear" w:color="auto" w:fill="D6E4F0"/>
+            <w:tcBorders>
+              <w:top w:val="single" w:sz="4" w:space="0" w:color="AAAAAA"/>
+              <w:left w:val="single" w:sz="4" w:space="0" w:color="AAAAAA"/>
+              <w:bottom w:val="single" w:sz="4" w:space="0" w:color="AAAAAA"/>
+              <w:right w:val="single" w:sz="4" w:space="0" w:color="AAAAAA"/>
+            </w:tcBorders>
+            <w:tcMar>
+              <w:top w:w="80" w:type="dxa"/>
+              <w:left w:w="80" w:type="dxa"/>
+              <w:bottom w:w="80" w:type="dxa"/>
+              <w:right w:w="80" w:type="dxa"/>
+            </w:tcMar>
+          </w:tcPr>
+          <w:p>
+            <w:r>
+              <w:rPr>
+                <w:rFonts w:ascii="Arial" w:hAnsi="Arial"/>
+                <w:b w:val="0"/>
+                <w:i w:val="0"/>
+                <w:sz w:val="20"/>
+              </w:rPr>
+              <w:t>Structurally novel</w:t>
+            </w:r>
+          </w:p>
+        </w:tc>
+        <w:tc>
+          <w:tcPr>
+            <w:tcW w:type="dxa" w:w="2551"/>
+            <w:shd w:val="clear" w:color="auto" w:fill="D6E4F0"/>
+            <w:tcBorders>
+              <w:top w:val="single" w:sz="4" w:space="0" w:color="AAAAAA"/>
+              <w:left w:val="single" w:sz="4" w:space="0" w:color="AAAAAA"/>
+              <w:bottom w:val="single" w:sz="4" w:space="0" w:color="AAAAAA"/>
+              <w:right w:val="single" w:sz="4" w:space="0" w:color="AAAAAA"/>
+            </w:tcBorders>
+            <w:tcMar>
+              <w:top w:w="80" w:type="dxa"/>
+              <w:left w:w="80" w:type="dxa"/>
+              <w:bottom w:w="80" w:type="dxa"/>
+              <w:right w:w="80" w:type="dxa"/>
+            </w:tcMar>
+          </w:tcPr>
+          <w:p>
+            <w:r>
+              <w:rPr>
+                <w:rFonts w:ascii="Arial" w:hAnsi="Arial"/>
+                <w:b w:val="0"/>
+                <w:i w:val="0"/>
+                <w:sz w:val="20"/>
+              </w:rPr>
+              <w:t>Max Tanimoto &lt; 0.40</w:t>
+            </w:r>
+          </w:p>
+        </w:tc>
+        <w:tc>
+          <w:tcPr>
+            <w:tcW w:type="dxa" w:w="4252"/>
+            <w:shd w:val="clear" w:color="auto" w:fill="D6E4F0"/>
+            <w:tcBorders>
+              <w:top w:val="single" w:sz="4" w:space="0" w:color="AAAAAA"/>
+              <w:left w:val="single" w:sz="4" w:space="0" w:color="AAAAAA"/>
+              <w:bottom w:val="single" w:sz="4" w:space="0" w:color="AAAAAA"/>
+              <w:right w:val="single" w:sz="4" w:space="0" w:color="AAAAAA"/>
+            </w:tcBorders>
+            <w:tcMar>
+              <w:top w:w="80" w:type="dxa"/>
+              <w:left w:w="80" w:type="dxa"/>
+              <w:bottom w:w="80" w:type="dxa"/>
+              <w:right w:w="80" w:type="dxa"/>
+            </w:tcMar>
+          </w:tcPr>
+          <w:p>
+            <w:r>
+              <w:rPr>
+                <w:rFonts w:ascii="Arial" w:hAnsi="Arial"/>
+                <w:b w:val="0"/>
+                <w:i w:val="0"/>
+                <w:sz w:val="20"/>
+              </w:rPr>
+              <w:t>Distinct scaffold from all known antibiotics</w:t>
+            </w:r>
+          </w:p>
+        </w:tc>
+      </w:tr>
+      <w:tr>
+        <w:tc>
+          <w:tcPr>
+            <w:tcW w:type="dxa" w:w="2268"/>
+            <w:shd w:val="clear" w:color="auto" w:fill="FFFFFF"/>
+            <w:tcBorders>
+              <w:top w:val="single" w:sz="4" w:space="0" w:color="AAAAAA"/>
+              <w:left w:val="single" w:sz="4" w:space="0" w:color="AAAAAA"/>
+              <w:bottom w:val="single" w:sz="4" w:space="0" w:color="AAAAAA"/>
+              <w:right w:val="single" w:sz="4" w:space="0" w:color="AAAAAA"/>
+            </w:tcBorders>
+            <w:tcMar>
+              <w:top w:w="80" w:type="dxa"/>
+              <w:left w:w="80" w:type="dxa"/>
+              <w:bottom w:w="80" w:type="dxa"/>
+              <w:right w:w="80" w:type="dxa"/>
+            </w:tcMar>
+          </w:tcPr>
+          <w:p>
+            <w:r>
+              <w:rPr>
+                <w:rFonts w:ascii="Arial" w:hAnsi="Arial"/>
+                <w:b w:val="0"/>
+                <w:i w:val="0"/>
+                <w:sz w:val="20"/>
+              </w:rPr>
+              <w:t>Related scaffold</w:t>
+            </w:r>
+          </w:p>
+        </w:tc>
+        <w:tc>
+          <w:tcPr>
+            <w:tcW w:type="dxa" w:w="2551"/>
+            <w:shd w:val="clear" w:color="auto" w:fill="FFFFFF"/>
+            <w:tcBorders>
+              <w:top w:val="single" w:sz="4" w:space="0" w:color="AAAAAA"/>
+              <w:left w:val="single" w:sz="4" w:space="0" w:color="AAAAAA"/>
+              <w:bottom w:val="single" w:sz="4" w:space="0" w:color="AAAAAA"/>
+              <w:right w:val="single" w:sz="4" w:space="0" w:color="AAAAAA"/>
+            </w:tcBorders>
+            <w:tcMar>
+              <w:top w:w="80" w:type="dxa"/>
+              <w:left w:w="80" w:type="dxa"/>
+              <w:bottom w:w="80" w:type="dxa"/>
+              <w:right w:w="80" w:type="dxa"/>
+            </w:tcMar>
+          </w:tcPr>
+          <w:p>
+            <w:r>
+              <w:rPr>
+                <w:rFonts w:ascii="Arial" w:hAnsi="Arial"/>
+                <w:b w:val="0"/>
+                <w:i w:val="0"/>
+                <w:sz w:val="20"/>
+              </w:rPr>
+              <w:t>0.40 ≤ Tanimoto &lt; 0.70</w:t>
+            </w:r>
+          </w:p>
+        </w:tc>
+        <w:tc>
+          <w:tcPr>
+            <w:tcW w:type="dxa" w:w="4252"/>
+            <w:shd w:val="clear" w:color="auto" w:fill="FFFFFF"/>
+            <w:tcBorders>
+              <w:top w:val="single" w:sz="4" w:space="0" w:color="AAAAAA"/>
+              <w:left w:val="single" w:sz="4" w:space="0" w:color="AAAAAA"/>
+              <w:bottom w:val="single" w:sz="4" w:space="0" w:color="AAAAAA"/>
+              <w:right w:val="single" w:sz="4" w:space="0" w:color="AAAAAA"/>
+            </w:tcBorders>
+            <w:tcMar>
+              <w:top w:w="80" w:type="dxa"/>
+              <w:left w:w="80" w:type="dxa"/>
+              <w:bottom w:w="80" w:type="dxa"/>
+              <w:right w:w="80" w:type="dxa"/>
+            </w:tcMar>
+          </w:tcPr>
+          <w:p>
+            <w:r>
+              <w:rPr>
+                <w:rFonts w:ascii="Arial" w:hAnsi="Arial"/>
+                <w:b w:val="0"/>
+                <w:i w:val="0"/>
+                <w:sz w:val="20"/>
+              </w:rPr>
+              <w:t>Same chemical class territory, not identical</w:t>
+            </w:r>
+          </w:p>
+        </w:tc>
+      </w:tr>
+      <w:tr>
+        <w:tc>
+          <w:tcPr>
+            <w:tcW w:type="dxa" w:w="2268"/>
+            <w:shd w:val="clear" w:color="auto" w:fill="D6E4F0"/>
+            <w:tcBorders>
+              <w:top w:val="single" w:sz="4" w:space="0" w:color="AAAAAA"/>
+              <w:left w:val="single" w:sz="4" w:space="0" w:color="AAAAAA"/>
+              <w:bottom w:val="single" w:sz="4" w:space="0" w:color="AAAAAA"/>
+              <w:right w:val="single" w:sz="4" w:space="0" w:color="AAAAAA"/>
+            </w:tcBorders>
+            <w:tcMar>
+              <w:top w:w="80" w:type="dxa"/>
+              <w:left w:w="80" w:type="dxa"/>
+              <w:bottom w:w="80" w:type="dxa"/>
+              <w:right w:w="80" w:type="dxa"/>
+            </w:tcMar>
+          </w:tcPr>
+          <w:p>
+            <w:r>
+              <w:rPr>
+                <w:rFonts w:ascii="Arial" w:hAnsi="Arial"/>
+                <w:b w:val="0"/>
+                <w:i w:val="0"/>
+                <w:sz w:val="20"/>
+              </w:rPr>
+              <w:t>Likely rediscovery</w:t>
+            </w:r>
+          </w:p>
+        </w:tc>
+        <w:tc>
+          <w:tcPr>
+            <w:tcW w:type="dxa" w:w="2551"/>
+            <w:shd w:val="clear" w:color="auto" w:fill="D6E4F0"/>
+            <w:tcBorders>
+              <w:top w:val="single" w:sz="4" w:space="0" w:color="AAAAAA"/>
+              <w:left w:val="single" w:sz="4" w:space="0" w:color="AAAAAA"/>
+              <w:bottom w:val="single" w:sz="4" w:space="0" w:color="AAAAAA"/>
+              <w:right w:val="single" w:sz="4" w:space="0" w:color="AAAAAA"/>
+            </w:tcBorders>
+            <w:tcMar>
+              <w:top w:w="80" w:type="dxa"/>
+              <w:left w:w="80" w:type="dxa"/>
+              <w:bottom w:w="80" w:type="dxa"/>
+              <w:right w:w="80" w:type="dxa"/>
+            </w:tcMar>
+          </w:tcPr>
+          <w:p>
+            <w:r>
+              <w:rPr>
+                <w:rFonts w:ascii="Arial" w:hAnsi="Arial"/>
+                <w:b w:val="0"/>
+                <w:i w:val="0"/>
+                <w:sz w:val="20"/>
+              </w:rPr>
+              <w:t>Max Tanimoto ≥ 0.70</w:t>
+            </w:r>
+          </w:p>
+        </w:tc>
+        <w:tc>
+          <w:tcPr>
+            <w:tcW w:type="dxa" w:w="4252"/>
+            <w:shd w:val="clear" w:color="auto" w:fill="D6E4F0"/>
+            <w:tcBorders>
+              <w:top w:val="single" w:sz="4" w:space="0" w:color="AAAAAA"/>
+              <w:left w:val="single" w:sz="4" w:space="0" w:color="AAAAAA"/>
+              <w:bottom w:val="single" w:sz="4" w:space="0" w:color="AAAAAA"/>
+              <w:right w:val="single" w:sz="4" w:space="0" w:color="AAAAAA"/>
+            </w:tcBorders>
+            <w:tcMar>
+              <w:top w:w="80" w:type="dxa"/>
+              <w:left w:w="80" w:type="dxa"/>
+              <w:bottom w:w="80" w:type="dxa"/>
+              <w:right w:w="80" w:type="dxa"/>
+            </w:tcMar>
+          </w:tcPr>
+          <w:p>
+            <w:r>
+              <w:rPr>
+                <w:rFonts w:ascii="Arial" w:hAnsi="Arial"/>
+                <w:b w:val="0"/>
+                <w:i w:val="0"/>
+                <w:sz w:val="20"/>
+              </w:rPr>
+              <w:t>High similarity — likely a known antibiotic</w:t>
+            </w:r>
+          </w:p>
+        </w:tc>
+      </w:tr>
+    </w:tbl>
+    <w:p>
+      <w:pPr>
+        <w:spacing w:after="80"/>
+      </w:pPr>
+    </w:p>
+    <w:p>
+      <w:pPr>
+        <w:spacing w:before="200" w:after="60"/>
+      </w:pPr>
+      <w:r>
+        <w:rPr>
+          <w:rFonts w:ascii="Arial" w:hAnsi="Arial"/>
+          <w:b/>
+          <w:i w:val="0"/>
+          <w:color w:val="1F4E79"/>
+          <w:sz w:val="24"/>
+        </w:rPr>
+        <w:t>9.2 Results</w:t>
+      </w:r>
+    </w:p>
+    <w:tbl>
+      <w:tblPr>
+        <w:tblStyle w:val="TableGrid"/>
+        <w:tblW w:type="auto" w:w="0"/>
+        <w:jc w:val="left"/>
+        <w:tblLook w:firstColumn="1" w:firstRow="1" w:lastColumn="0" w:lastRow="0" w:noHBand="0" w:noVBand="1" w:val="04A0"/>
+      </w:tblPr>
+      <w:tblGrid>
+        <w:gridCol w:w="3120"/>
+        <w:gridCol w:w="3120"/>
+        <w:gridCol w:w="3120"/>
+      </w:tblGrid>
+      <w:tr>
+        <w:tc>
+          <w:tcPr>
+            <w:tcW w:type="dxa" w:w="2835"/>
+            <w:shd w:val="clear" w:color="auto" w:fill="2E75B6"/>
+            <w:tcBorders>
+              <w:top w:val="single" w:sz="4" w:space="0" w:color="AAAAAA"/>
+              <w:left w:val="single" w:sz="4" w:space="0" w:color="AAAAAA"/>
+              <w:bottom w:val="single" w:sz="4" w:space="0" w:color="AAAAAA"/>
+              <w:right w:val="single" w:sz="4" w:space="0" w:color="AAAAAA"/>
+            </w:tcBorders>
+            <w:tcMar>
+              <w:top w:w="80" w:type="dxa"/>
+              <w:left w:w="80" w:type="dxa"/>
+              <w:bottom w:w="80" w:type="dxa"/>
+              <w:right w:w="80" w:type="dxa"/>
+            </w:tcMar>
+          </w:tcPr>
+          <w:p>
+            <w:r>
+              <w:rPr>
+                <w:rFonts w:ascii="Arial" w:hAnsi="Arial"/>
+                <w:b/>
+                <w:i w:val="0"/>
+                <w:color w:val="FFFFFF"/>
+                <w:sz w:val="20"/>
+              </w:rPr>
+              <w:t>Category</w:t>
+            </w:r>
+          </w:p>
+        </w:tc>
+        <w:tc>
+          <w:tcPr>
+            <w:tcW w:type="dxa" w:w="2268"/>
+            <w:shd w:val="clear" w:color="auto" w:fill="2E75B6"/>
+            <w:tcBorders>
+              <w:top w:val="single" w:sz="4" w:space="0" w:color="AAAAAA"/>
+              <w:left w:val="single" w:sz="4" w:space="0" w:color="AAAAAA"/>
+              <w:bottom w:val="single" w:sz="4" w:space="0" w:color="AAAAAA"/>
+              <w:right w:val="single" w:sz="4" w:space="0" w:color="AAAAAA"/>
+            </w:tcBorders>
+            <w:tcMar>
+              <w:top w:w="80" w:type="dxa"/>
+              <w:left w:w="80" w:type="dxa"/>
+              <w:bottom w:w="80" w:type="dxa"/>
+              <w:right w:w="80" w:type="dxa"/>
+            </w:tcMar>
+          </w:tcPr>
+          <w:p>
+            <w:r>
+              <w:rPr>
+                <w:rFonts w:ascii="Arial" w:hAnsi="Arial"/>
+                <w:b/>
+                <w:i w:val="0"/>
+                <w:color w:val="FFFFFF"/>
+                <w:sz w:val="20"/>
+              </w:rPr>
+              <w:t>Count (of top 50)</w:t>
+            </w:r>
+          </w:p>
+        </w:tc>
+        <w:tc>
+          <w:tcPr>
+            <w:tcW w:type="dxa" w:w="3969"/>
+            <w:shd w:val="clear" w:color="auto" w:fill="2E75B6"/>
+            <w:tcBorders>
+              <w:top w:val="single" w:sz="4" w:space="0" w:color="AAAAAA"/>
+              <w:left w:val="single" w:sz="4" w:space="0" w:color="AAAAAA"/>
+              <w:bottom w:val="single" w:sz="4" w:space="0" w:color="AAAAAA"/>
+              <w:right w:val="single" w:sz="4" w:space="0" w:color="AAAAAA"/>
+            </w:tcBorders>
+            <w:tcMar>
+              <w:top w:w="80" w:type="dxa"/>
+              <w:left w:w="80" w:type="dxa"/>
+              <w:bottom w:w="80" w:type="dxa"/>
+              <w:right w:w="80" w:type="dxa"/>
+            </w:tcMar>
+          </w:tcPr>
+          <w:p>
+            <w:r>
+              <w:rPr>
+                <w:rFonts w:ascii="Arial" w:hAnsi="Arial"/>
+                <w:b/>
+                <w:i w:val="0"/>
+                <w:color w:val="FFFFFF"/>
+                <w:sz w:val="20"/>
+              </w:rPr>
+              <w:t>True Actives in Category</w:t>
+            </w:r>
+          </w:p>
+        </w:tc>
+      </w:tr>
+      <w:tr>
+        <w:tc>
+          <w:tcPr>
+            <w:tcW w:type="dxa" w:w="2835"/>
+            <w:shd w:val="clear" w:color="auto" w:fill="D6E4F0"/>
+            <w:tcBorders>
+              <w:top w:val="single" w:sz="4" w:space="0" w:color="AAAAAA"/>
+              <w:left w:val="single" w:sz="4" w:space="0" w:color="AAAAAA"/>
+              <w:bottom w:val="single" w:sz="4" w:space="0" w:color="AAAAAA"/>
+              <w:right w:val="single" w:sz="4" w:space="0" w:color="AAAAAA"/>
+            </w:tcBorders>
+            <w:tcMar>
+              <w:top w:w="80" w:type="dxa"/>
+              <w:left w:w="80" w:type="dxa"/>
+              <w:bottom w:w="80" w:type="dxa"/>
+              <w:right w:w="80" w:type="dxa"/>
+            </w:tcMar>
+          </w:tcPr>
+          <w:p>
+            <w:r>
+              <w:rPr>
+                <w:rFonts w:ascii="Arial" w:hAnsi="Arial"/>
+                <w:b w:val="0"/>
+                <w:i w:val="0"/>
+                <w:sz w:val="20"/>
+              </w:rPr>
+              <w:t>Structurally novel</w:t>
+            </w:r>
+          </w:p>
+        </w:tc>
+        <w:tc>
+          <w:tcPr>
+            <w:tcW w:type="dxa" w:w="2268"/>
+            <w:shd w:val="clear" w:color="auto" w:fill="D6E4F0"/>
+            <w:tcBorders>
+              <w:top w:val="single" w:sz="4" w:space="0" w:color="AAAAAA"/>
+              <w:left w:val="single" w:sz="4" w:space="0" w:color="AAAAAA"/>
+              <w:bottom w:val="single" w:sz="4" w:space="0" w:color="AAAAAA"/>
+              <w:right w:val="single" w:sz="4" w:space="0" w:color="AAAAAA"/>
+            </w:tcBorders>
+            <w:tcMar>
+              <w:top w:w="80" w:type="dxa"/>
+              <w:left w:w="80" w:type="dxa"/>
+              <w:bottom w:w="80" w:type="dxa"/>
+              <w:right w:w="80" w:type="dxa"/>
+            </w:tcMar>
+          </w:tcPr>
+          <w:p>
+            <w:r>
+              <w:rPr>
+                <w:rFonts w:ascii="Arial" w:hAnsi="Arial"/>
+                <w:b w:val="0"/>
+                <w:i w:val="0"/>
+                <w:sz w:val="20"/>
+              </w:rPr>
+              <w:t>43 (86%)</w:t>
+            </w:r>
+          </w:p>
+        </w:tc>
+        <w:tc>
+          <w:tcPr>
+            <w:tcW w:type="dxa" w:w="3969"/>
+            <w:shd w:val="clear" w:color="auto" w:fill="D6E4F0"/>
+            <w:tcBorders>
+              <w:top w:val="single" w:sz="4" w:space="0" w:color="AAAAAA"/>
+              <w:left w:val="single" w:sz="4" w:space="0" w:color="AAAAAA"/>
+              <w:bottom w:val="single" w:sz="4" w:space="0" w:color="AAAAAA"/>
+              <w:right w:val="single" w:sz="4" w:space="0" w:color="AAAAAA"/>
+            </w:tcBorders>
+            <w:tcMar>
+              <w:top w:w="80" w:type="dxa"/>
+              <w:left w:w="80" w:type="dxa"/>
+              <w:bottom w:w="80" w:type="dxa"/>
+              <w:right w:w="80" w:type="dxa"/>
+            </w:tcMar>
+          </w:tcPr>
+          <w:p>
+            <w:r>
+              <w:rPr>
+                <w:rFonts w:ascii="Arial" w:hAnsi="Arial"/>
+                <w:b w:val="0"/>
+                <w:i w:val="0"/>
+                <w:sz w:val="20"/>
+              </w:rPr>
+              <w:t>11</w:t>
+            </w:r>
+          </w:p>
+        </w:tc>
+      </w:tr>
+      <w:tr>
+        <w:tc>
+          <w:tcPr>
+            <w:tcW w:type="dxa" w:w="2835"/>
+            <w:shd w:val="clear" w:color="auto" w:fill="FFFFFF"/>
+            <w:tcBorders>
+              <w:top w:val="single" w:sz="4" w:space="0" w:color="AAAAAA"/>
+              <w:left w:val="single" w:sz="4" w:space="0" w:color="AAAAAA"/>
+              <w:bottom w:val="single" w:sz="4" w:space="0" w:color="AAAAAA"/>
+              <w:right w:val="single" w:sz="4" w:space="0" w:color="AAAAAA"/>
+            </w:tcBorders>
+            <w:tcMar>
+              <w:top w:w="80" w:type="dxa"/>
+              <w:left w:w="80" w:type="dxa"/>
+              <w:bottom w:w="80" w:type="dxa"/>
+              <w:right w:w="80" w:type="dxa"/>
+            </w:tcMar>
+          </w:tcPr>
+          <w:p>
+            <w:r>
+              <w:rPr>
+                <w:rFonts w:ascii="Arial" w:hAnsi="Arial"/>
+                <w:b w:val="0"/>
+                <w:i w:val="0"/>
+                <w:sz w:val="20"/>
+              </w:rPr>
+              <w:t>Related scaffold</w:t>
+            </w:r>
+          </w:p>
+        </w:tc>
+        <w:tc>
+          <w:tcPr>
+            <w:tcW w:type="dxa" w:w="2268"/>
+            <w:shd w:val="clear" w:color="auto" w:fill="FFFFFF"/>
+            <w:tcBorders>
+              <w:top w:val="single" w:sz="4" w:space="0" w:color="AAAAAA"/>
+              <w:left w:val="single" w:sz="4" w:space="0" w:color="AAAAAA"/>
+              <w:bottom w:val="single" w:sz="4" w:space="0" w:color="AAAAAA"/>
+              <w:right w:val="single" w:sz="4" w:space="0" w:color="AAAAAA"/>
+            </w:tcBorders>
+            <w:tcMar>
+              <w:top w:w="80" w:type="dxa"/>
+              <w:left w:w="80" w:type="dxa"/>
+              <w:bottom w:w="80" w:type="dxa"/>
+              <w:right w:w="80" w:type="dxa"/>
+            </w:tcMar>
+          </w:tcPr>
+          <w:p>
+            <w:r>
+              <w:rPr>
+                <w:rFonts w:ascii="Arial" w:hAnsi="Arial"/>
+                <w:b w:val="0"/>
+                <w:i w:val="0"/>
+                <w:sz w:val="20"/>
+              </w:rPr>
+              <w:t>7 (14%)</w:t>
+            </w:r>
+          </w:p>
+        </w:tc>
+        <w:tc>
+          <w:tcPr>
+            <w:tcW w:type="dxa" w:w="3969"/>
+            <w:shd w:val="clear" w:color="auto" w:fill="FFFFFF"/>
+            <w:tcBorders>
+              <w:top w:val="single" w:sz="4" w:space="0" w:color="AAAAAA"/>
+              <w:left w:val="single" w:sz="4" w:space="0" w:color="AAAAAA"/>
+              <w:bottom w:val="single" w:sz="4" w:space="0" w:color="AAAAAA"/>
+              <w:right w:val="single" w:sz="4" w:space="0" w:color="AAAAAA"/>
+            </w:tcBorders>
+            <w:tcMar>
+              <w:top w:w="80" w:type="dxa"/>
+              <w:left w:w="80" w:type="dxa"/>
+              <w:bottom w:w="80" w:type="dxa"/>
+              <w:right w:w="80" w:type="dxa"/>
+            </w:tcMar>
+          </w:tcPr>
+          <w:p>
+            <w:r>
+              <w:rPr>
+                <w:rFonts w:ascii="Arial" w:hAnsi="Arial"/>
+                <w:b w:val="0"/>
+                <w:i w:val="0"/>
+                <w:sz w:val="20"/>
+              </w:rPr>
+              <w:t>4</w:t>
+            </w:r>
+          </w:p>
+        </w:tc>
+      </w:tr>
+      <w:tr>
+        <w:tc>
+          <w:tcPr>
+            <w:tcW w:type="dxa" w:w="2835"/>
+            <w:shd w:val="clear" w:color="auto" w:fill="D6E4F0"/>
+            <w:tcBorders>
+              <w:top w:val="single" w:sz="4" w:space="0" w:color="AAAAAA"/>
+              <w:left w:val="single" w:sz="4" w:space="0" w:color="AAAAAA"/>
+              <w:bottom w:val="single" w:sz="4" w:space="0" w:color="AAAAAA"/>
+              <w:right w:val="single" w:sz="4" w:space="0" w:color="AAAAAA"/>
+            </w:tcBorders>
+            <w:tcMar>
+              <w:top w:w="80" w:type="dxa"/>
+              <w:left w:w="80" w:type="dxa"/>
+              <w:bottom w:w="80" w:type="dxa"/>
+              <w:right w:w="80" w:type="dxa"/>
+            </w:tcMar>
+          </w:tcPr>
+          <w:p>
+            <w:r>
+              <w:rPr>
+                <w:rFonts w:ascii="Arial" w:hAnsi="Arial"/>
+                <w:b w:val="0"/>
+                <w:i w:val="0"/>
+                <w:sz w:val="20"/>
+              </w:rPr>
+              <w:t>Likely rediscovery</w:t>
+            </w:r>
+          </w:p>
+        </w:tc>
+        <w:tc>
+          <w:tcPr>
+            <w:tcW w:type="dxa" w:w="2268"/>
+            <w:shd w:val="clear" w:color="auto" w:fill="D6E4F0"/>
+            <w:tcBorders>
+              <w:top w:val="single" w:sz="4" w:space="0" w:color="AAAAAA"/>
+              <w:left w:val="single" w:sz="4" w:space="0" w:color="AAAAAA"/>
+              <w:bottom w:val="single" w:sz="4" w:space="0" w:color="AAAAAA"/>
+              <w:right w:val="single" w:sz="4" w:space="0" w:color="AAAAAA"/>
+            </w:tcBorders>
+            <w:tcMar>
+              <w:top w:w="80" w:type="dxa"/>
+              <w:left w:w="80" w:type="dxa"/>
+              <w:bottom w:w="80" w:type="dxa"/>
+              <w:right w:w="80" w:type="dxa"/>
+            </w:tcMar>
+          </w:tcPr>
+          <w:p>
+            <w:r>
+              <w:rPr>
+                <w:rFonts w:ascii="Arial" w:hAnsi="Arial"/>
+                <w:b w:val="0"/>
+                <w:i w:val="0"/>
+                <w:sz w:val="20"/>
+              </w:rPr>
+              <w:t>0 (0%)</w:t>
+            </w:r>
+          </w:p>
+        </w:tc>
+        <w:tc>
+          <w:tcPr>
+            <w:tcW w:type="dxa" w:w="3969"/>
+            <w:shd w:val="clear" w:color="auto" w:fill="D6E4F0"/>
+            <w:tcBorders>
+              <w:top w:val="single" w:sz="4" w:space="0" w:color="AAAAAA"/>
+              <w:left w:val="single" w:sz="4" w:space="0" w:color="AAAAAA"/>
+              <w:bottom w:val="single" w:sz="4" w:space="0" w:color="AAAAAA"/>
+              <w:right w:val="single" w:sz="4" w:space="0" w:color="AAAAAA"/>
+            </w:tcBorders>
+            <w:tcMar>
+              <w:top w:w="80" w:type="dxa"/>
+              <w:left w:w="80" w:type="dxa"/>
+              <w:bottom w:w="80" w:type="dxa"/>
+              <w:right w:w="80" w:type="dxa"/>
+            </w:tcMar>
+          </w:tcPr>
+          <w:p>
+            <w:r>
+              <w:rPr>
+                <w:rFonts w:ascii="Arial" w:hAnsi="Arial"/>
+                <w:b w:val="0"/>
+                <w:i w:val="0"/>
+                <w:sz w:val="20"/>
+              </w:rPr>
+              <w:t>0</w:t>
+            </w:r>
+          </w:p>
+        </w:tc>
+      </w:tr>
+    </w:tbl>
+    <w:p>
+      <w:pPr>
+        <w:spacing w:after="80"/>
+      </w:pPr>
+    </w:p>
+    <w:p>
+      <w:pPr>
+        <w:spacing w:after="120"/>
+      </w:pPr>
+      <w:r>
+        <w:rPr>
+          <w:rFonts w:ascii="Arial" w:hAnsi="Arial"/>
+          <w:b w:val="0"/>
+          <w:i w:val="0"/>
+          <w:sz w:val="21"/>
+        </w:rPr>
+        <w:t>No predicted compound shows Tanimoto similarity ≥ 0.70 to any known antibiotic — zero likely rediscoveries across the top 50. 86% are structurally novel by the scaffold-level threshold. 11 of the 15 confirmed actives in the top 50 are structurally novel, with maximum Tanimoto similarities ranging from 0.13 to 0.29.</w:t>
+      </w:r>
+    </w:p>
+    <w:p>
+      <w:pPr>
+        <w:spacing w:before="200" w:after="60"/>
+      </w:pPr>
+      <w:r>
+        <w:rPr>
+          <w:rFonts w:ascii="Arial" w:hAnsi="Arial"/>
+          <w:b/>
+          <w:i w:val="0"/>
+          <w:color w:val="1F4E79"/>
+          <w:sz w:val="24"/>
+        </w:rPr>
+        <w:t>9.3 Structurally Novel True Actives</w:t>
+      </w:r>
+    </w:p>
+    <w:p>
+      <w:pPr>
+        <w:spacing w:after="120"/>
+      </w:pPr>
+      <w:r>
+        <w:rPr>
+          <w:rFonts w:ascii="Arial" w:hAnsi="Arial"/>
+          <w:b w:val="0"/>
+          <w:i w:val="0"/>
+          <w:sz w:val="21"/>
+        </w:rPr>
+        <w:t>11 confirmed active compounds are structurally distinct from all 19 reference antibiotics:</w:t>
+      </w:r>
+    </w:p>
+    <w:tbl>
+      <w:tblPr>
+        <w:tblStyle w:val="TableGrid"/>
+        <w:tblW w:type="auto" w:w="0"/>
+        <w:jc w:val="left"/>
+        <w:tblLook w:firstColumn="1" w:firstRow="1" w:lastColumn="0" w:lastRow="0" w:noHBand="0" w:noVBand="1" w:val="04A0"/>
+      </w:tblPr>
+      <w:tblGrid>
+        <w:gridCol w:w="1872"/>
+        <w:gridCol w:w="1872"/>
+        <w:gridCol w:w="1872"/>
+        <w:gridCol w:w="1872"/>
+        <w:gridCol w:w="1872"/>
+      </w:tblGrid>
+      <w:tr>
+        <w:tc>
+          <w:tcPr>
+            <w:tcW w:type="dxa" w:w="680"/>
+            <w:shd w:val="clear" w:color="auto" w:fill="2E75B6"/>
+            <w:tcBorders>
+              <w:top w:val="single" w:sz="4" w:space="0" w:color="AAAAAA"/>
+              <w:left w:val="single" w:sz="4" w:space="0" w:color="AAAAAA"/>
+              <w:bottom w:val="single" w:sz="4" w:space="0" w:color="AAAAAA"/>
+              <w:right w:val="single" w:sz="4" w:space="0" w:color="AAAAAA"/>
+            </w:tcBorders>
+            <w:tcMar>
+              <w:top w:w="80" w:type="dxa"/>
+              <w:left w:w="80" w:type="dxa"/>
+              <w:bottom w:w="80" w:type="dxa"/>
+              <w:right w:w="80" w:type="dxa"/>
+            </w:tcMar>
+          </w:tcPr>
+          <w:p>
+            <w:r>
+              <w:rPr>
+                <w:rFonts w:ascii="Arial" w:hAnsi="Arial"/>
+                <w:b/>
+                <w:i w:val="0"/>
+                <w:color w:val="FFFFFF"/>
+                <w:sz w:val="20"/>
+              </w:rPr>
+              <w:t>Rank</w:t>
+            </w:r>
+          </w:p>
+        </w:tc>
+        <w:tc>
+          <w:tcPr>
+            <w:tcW w:type="dxa" w:w="1304"/>
+            <w:shd w:val="clear" w:color="auto" w:fill="2E75B6"/>
+            <w:tcBorders>
+              <w:top w:val="single" w:sz="4" w:space="0" w:color="AAAAAA"/>
+              <w:left w:val="single" w:sz="4" w:space="0" w:color="AAAAAA"/>
+              <w:bottom w:val="single" w:sz="4" w:space="0" w:color="AAAAAA"/>
+              <w:right w:val="single" w:sz="4" w:space="0" w:color="AAAAAA"/>
+            </w:tcBorders>
+            <w:tcMar>
+              <w:top w:w="80" w:type="dxa"/>
+              <w:left w:w="80" w:type="dxa"/>
+              <w:bottom w:w="80" w:type="dxa"/>
+              <w:right w:w="80" w:type="dxa"/>
+            </w:tcMar>
+          </w:tcPr>
+          <w:p>
+            <w:r>
+              <w:rPr>
+                <w:rFonts w:ascii="Arial" w:hAnsi="Arial"/>
+                <w:b/>
+                <w:i w:val="0"/>
+                <w:color w:val="FFFFFF"/>
+                <w:sz w:val="20"/>
+              </w:rPr>
+              <w:t>Pred. Prob</w:t>
+            </w:r>
+          </w:p>
+        </w:tc>
+        <w:tc>
+          <w:tcPr>
+            <w:tcW w:type="dxa" w:w="1304"/>
+            <w:shd w:val="clear" w:color="auto" w:fill="2E75B6"/>
+            <w:tcBorders>
+              <w:top w:val="single" w:sz="4" w:space="0" w:color="AAAAAA"/>
+              <w:left w:val="single" w:sz="4" w:space="0" w:color="AAAAAA"/>
+              <w:bottom w:val="single" w:sz="4" w:space="0" w:color="AAAAAA"/>
+              <w:right w:val="single" w:sz="4" w:space="0" w:color="AAAAAA"/>
+            </w:tcBorders>
+            <w:tcMar>
+              <w:top w:w="80" w:type="dxa"/>
+              <w:left w:w="80" w:type="dxa"/>
+              <w:bottom w:w="80" w:type="dxa"/>
+              <w:right w:w="80" w:type="dxa"/>
+            </w:tcMar>
+          </w:tcPr>
+          <w:p>
+            <w:r>
+              <w:rPr>
+                <w:rFonts w:ascii="Arial" w:hAnsi="Arial"/>
+                <w:b/>
+                <w:i w:val="0"/>
+                <w:color w:val="FFFFFF"/>
+                <w:sz w:val="20"/>
+              </w:rPr>
+              <w:t>Max Sim</w:t>
+            </w:r>
+          </w:p>
+        </w:tc>
+        <w:tc>
+          <w:tcPr>
+            <w:tcW w:type="dxa" w:w="1984"/>
+            <w:shd w:val="clear" w:color="auto" w:fill="2E75B6"/>
+            <w:tcBorders>
+              <w:top w:val="single" w:sz="4" w:space="0" w:color="AAAAAA"/>
+              <w:left w:val="single" w:sz="4" w:space="0" w:color="AAAAAA"/>
+              <w:bottom w:val="single" w:sz="4" w:space="0" w:color="AAAAAA"/>
+              <w:right w:val="single" w:sz="4" w:space="0" w:color="AAAAAA"/>
+            </w:tcBorders>
+            <w:tcMar>
+              <w:top w:w="80" w:type="dxa"/>
+              <w:left w:w="80" w:type="dxa"/>
+              <w:bottom w:w="80" w:type="dxa"/>
+              <w:right w:w="80" w:type="dxa"/>
+            </w:tcMar>
+          </w:tcPr>
+          <w:p>
+            <w:r>
+              <w:rPr>
+                <w:rFonts w:ascii="Arial" w:hAnsi="Arial"/>
+                <w:b/>
+                <w:i w:val="0"/>
+                <w:color w:val="FFFFFF"/>
+                <w:sz w:val="20"/>
+              </w:rPr>
+              <w:t>Most Similar To</w:t>
+            </w:r>
+          </w:p>
+        </w:tc>
+        <w:tc>
+          <w:tcPr>
+            <w:tcW w:type="dxa" w:w="3798"/>
+            <w:shd w:val="clear" w:color="auto" w:fill="2E75B6"/>
+            <w:tcBorders>
+              <w:top w:val="single" w:sz="4" w:space="0" w:color="AAAAAA"/>
+              <w:left w:val="single" w:sz="4" w:space="0" w:color="AAAAAA"/>
+              <w:bottom w:val="single" w:sz="4" w:space="0" w:color="AAAAAA"/>
+              <w:right w:val="single" w:sz="4" w:space="0" w:color="AAAAAA"/>
+            </w:tcBorders>
+            <w:tcMar>
+              <w:top w:w="80" w:type="dxa"/>
+              <w:left w:w="80" w:type="dxa"/>
+              <w:bottom w:w="80" w:type="dxa"/>
+              <w:right w:w="80" w:type="dxa"/>
+            </w:tcMar>
+          </w:tcPr>
+          <w:p>
+            <w:r>
+              <w:rPr>
+                <w:rFonts w:ascii="Arial" w:hAnsi="Arial"/>
+                <w:b/>
+                <w:i w:val="0"/>
+                <w:color w:val="FFFFFF"/>
+                <w:sz w:val="20"/>
+              </w:rPr>
+              <w:t>Note</w:t>
+            </w:r>
+          </w:p>
+        </w:tc>
+      </w:tr>
+      <w:tr>
+        <w:tc>
+          <w:tcPr>
+            <w:tcW w:type="dxa" w:w="680"/>
+            <w:shd w:val="clear" w:color="auto" w:fill="D6E4F0"/>
+            <w:tcBorders>
+              <w:top w:val="single" w:sz="4" w:space="0" w:color="AAAAAA"/>
+              <w:left w:val="single" w:sz="4" w:space="0" w:color="AAAAAA"/>
+              <w:bottom w:val="single" w:sz="4" w:space="0" w:color="AAAAAA"/>
+              <w:right w:val="single" w:sz="4" w:space="0" w:color="AAAAAA"/>
+            </w:tcBorders>
+            <w:tcMar>
+              <w:top w:w="80" w:type="dxa"/>
+              <w:left w:w="80" w:type="dxa"/>
+              <w:bottom w:w="80" w:type="dxa"/>
+              <w:right w:w="80" w:type="dxa"/>
+            </w:tcMar>
+          </w:tcPr>
+          <w:p>
+            <w:r>
+              <w:rPr>
+                <w:rFonts w:ascii="Arial" w:hAnsi="Arial"/>
+                <w:b w:val="0"/>
+                <w:i w:val="0"/>
+                <w:sz w:val="20"/>
+              </w:rPr>
+              <w:t>1</w:t>
+            </w:r>
+          </w:p>
+        </w:tc>
+        <w:tc>
+          <w:tcPr>
+            <w:tcW w:type="dxa" w:w="1304"/>
+            <w:shd w:val="clear" w:color="auto" w:fill="D6E4F0"/>
+            <w:tcBorders>
+              <w:top w:val="single" w:sz="4" w:space="0" w:color="AAAAAA"/>
+              <w:left w:val="single" w:sz="4" w:space="0" w:color="AAAAAA"/>
+              <w:bottom w:val="single" w:sz="4" w:space="0" w:color="AAAAAA"/>
+              <w:right w:val="single" w:sz="4" w:space="0" w:color="AAAAAA"/>
+            </w:tcBorders>
+            <w:tcMar>
+              <w:top w:w="80" w:type="dxa"/>
+              <w:left w:w="80" w:type="dxa"/>
+              <w:bottom w:w="80" w:type="dxa"/>
+              <w:right w:w="80" w:type="dxa"/>
+            </w:tcMar>
+          </w:tcPr>
+          <w:p>
+            <w:r>
+              <w:rPr>
+                <w:rFonts w:ascii="Arial" w:hAnsi="Arial"/>
+                <w:b w:val="0"/>
+                <w:i w:val="0"/>
+                <w:sz w:val="20"/>
+              </w:rPr>
+              <w:t>0.999</w:t>
+            </w:r>
+          </w:p>
+        </w:tc>
+        <w:tc>
+          <w:tcPr>
+            <w:tcW w:type="dxa" w:w="1304"/>
+            <w:shd w:val="clear" w:color="auto" w:fill="D6E4F0"/>
+            <w:tcBorders>
+              <w:top w:val="single" w:sz="4" w:space="0" w:color="AAAAAA"/>
+              <w:left w:val="single" w:sz="4" w:space="0" w:color="AAAAAA"/>
+              <w:bottom w:val="single" w:sz="4" w:space="0" w:color="AAAAAA"/>
+              <w:right w:val="single" w:sz="4" w:space="0" w:color="AAAAAA"/>
+            </w:tcBorders>
+            <w:tcMar>
+              <w:top w:w="80" w:type="dxa"/>
+              <w:left w:w="80" w:type="dxa"/>
+              <w:bottom w:w="80" w:type="dxa"/>
+              <w:right w:w="80" w:type="dxa"/>
+            </w:tcMar>
+          </w:tcPr>
+          <w:p>
+            <w:r>
+              <w:rPr>
+                <w:rFonts w:ascii="Arial" w:hAnsi="Arial"/>
+                <w:b w:val="0"/>
+                <w:i w:val="0"/>
+                <w:sz w:val="20"/>
+              </w:rPr>
+              <w:t>0.196</w:t>
+            </w:r>
+          </w:p>
+        </w:tc>
+        <w:tc>
+          <w:tcPr>
+            <w:tcW w:type="dxa" w:w="1984"/>
+            <w:shd w:val="clear" w:color="auto" w:fill="D6E4F0"/>
+            <w:tcBorders>
+              <w:top w:val="single" w:sz="4" w:space="0" w:color="AAAAAA"/>
+              <w:left w:val="single" w:sz="4" w:space="0" w:color="AAAAAA"/>
+              <w:bottom w:val="single" w:sz="4" w:space="0" w:color="AAAAAA"/>
+              <w:right w:val="single" w:sz="4" w:space="0" w:color="AAAAAA"/>
+            </w:tcBorders>
+            <w:tcMar>
+              <w:top w:w="80" w:type="dxa"/>
+              <w:left w:w="80" w:type="dxa"/>
+              <w:bottom w:w="80" w:type="dxa"/>
+              <w:right w:w="80" w:type="dxa"/>
+            </w:tcMar>
+          </w:tcPr>
+          <w:p>
+            <w:r>
+              <w:rPr>
+                <w:rFonts w:ascii="Arial" w:hAnsi="Arial"/>
+                <w:b w:val="0"/>
+                <w:i w:val="0"/>
+                <w:sz w:val="20"/>
+              </w:rPr>
+              <w:t>Ampicillin</w:t>
+            </w:r>
+          </w:p>
+        </w:tc>
+        <w:tc>
+          <w:tcPr>
+            <w:tcW w:type="dxa" w:w="3798"/>
+            <w:shd w:val="clear" w:color="auto" w:fill="D6E4F0"/>
+            <w:tcBorders>
+              <w:top w:val="single" w:sz="4" w:space="0" w:color="AAAAAA"/>
+              <w:left w:val="single" w:sz="4" w:space="0" w:color="AAAAAA"/>
+              <w:bottom w:val="single" w:sz="4" w:space="0" w:color="AAAAAA"/>
+              <w:right w:val="single" w:sz="4" w:space="0" w:color="AAAAAA"/>
+            </w:tcBorders>
+            <w:tcMar>
+              <w:top w:w="80" w:type="dxa"/>
+              <w:left w:w="80" w:type="dxa"/>
+              <w:bottom w:w="80" w:type="dxa"/>
+              <w:right w:w="80" w:type="dxa"/>
+            </w:tcMar>
+          </w:tcPr>
+          <w:p>
+            <w:r>
+              <w:rPr>
+                <w:rFonts w:ascii="Arial" w:hAnsi="Arial"/>
+                <w:b w:val="0"/>
+                <w:i w:val="0"/>
+                <w:sz w:val="20"/>
+              </w:rPr>
+              <w:t>Cephem core with novel aminothiazole sidechain</w:t>
+            </w:r>
+          </w:p>
+        </w:tc>
+      </w:tr>
+      <w:tr>
+        <w:tc>
+          <w:tcPr>
+            <w:tcW w:type="dxa" w:w="680"/>
+            <w:shd w:val="clear" w:color="auto" w:fill="FFFFFF"/>
+            <w:tcBorders>
+              <w:top w:val="single" w:sz="4" w:space="0" w:color="AAAAAA"/>
+              <w:left w:val="single" w:sz="4" w:space="0" w:color="AAAAAA"/>
+              <w:bottom w:val="single" w:sz="4" w:space="0" w:color="AAAAAA"/>
+              <w:right w:val="single" w:sz="4" w:space="0" w:color="AAAAAA"/>
+            </w:tcBorders>
+            <w:tcMar>
+              <w:top w:w="80" w:type="dxa"/>
+              <w:left w:w="80" w:type="dxa"/>
+              <w:bottom w:w="80" w:type="dxa"/>
+              <w:right w:w="80" w:type="dxa"/>
+            </w:tcMar>
+          </w:tcPr>
+          <w:p>
+            <w:r>
+              <w:rPr>
+                <w:rFonts w:ascii="Arial" w:hAnsi="Arial"/>
+                <w:b w:val="0"/>
+                <w:i w:val="0"/>
+                <w:sz w:val="20"/>
+              </w:rPr>
+              <w:t>3</w:t>
+            </w:r>
+          </w:p>
+        </w:tc>
+        <w:tc>
+          <w:tcPr>
+            <w:tcW w:type="dxa" w:w="1304"/>
+            <w:shd w:val="clear" w:color="auto" w:fill="FFFFFF"/>
+            <w:tcBorders>
+              <w:top w:val="single" w:sz="4" w:space="0" w:color="AAAAAA"/>
+              <w:left w:val="single" w:sz="4" w:space="0" w:color="AAAAAA"/>
+              <w:bottom w:val="single" w:sz="4" w:space="0" w:color="AAAAAA"/>
+              <w:right w:val="single" w:sz="4" w:space="0" w:color="AAAAAA"/>
+            </w:tcBorders>
+            <w:tcMar>
+              <w:top w:w="80" w:type="dxa"/>
+              <w:left w:w="80" w:type="dxa"/>
+              <w:bottom w:w="80" w:type="dxa"/>
+              <w:right w:w="80" w:type="dxa"/>
+            </w:tcMar>
+          </w:tcPr>
+          <w:p>
+            <w:r>
+              <w:rPr>
+                <w:rFonts w:ascii="Arial" w:hAnsi="Arial"/>
+                <w:b w:val="0"/>
+                <w:i w:val="0"/>
+                <w:sz w:val="20"/>
+              </w:rPr>
+              <w:t>0.998</w:t>
+            </w:r>
+          </w:p>
+        </w:tc>
+        <w:tc>
+          <w:tcPr>
+            <w:tcW w:type="dxa" w:w="1304"/>
+            <w:shd w:val="clear" w:color="auto" w:fill="FFFFFF"/>
+            <w:tcBorders>
+              <w:top w:val="single" w:sz="4" w:space="0" w:color="AAAAAA"/>
+              <w:left w:val="single" w:sz="4" w:space="0" w:color="AAAAAA"/>
+              <w:bottom w:val="single" w:sz="4" w:space="0" w:color="AAAAAA"/>
+              <w:right w:val="single" w:sz="4" w:space="0" w:color="AAAAAA"/>
+            </w:tcBorders>
+            <w:tcMar>
+              <w:top w:w="80" w:type="dxa"/>
+              <w:left w:w="80" w:type="dxa"/>
+              <w:bottom w:w="80" w:type="dxa"/>
+              <w:right w:w="80" w:type="dxa"/>
+            </w:tcMar>
+          </w:tcPr>
+          <w:p>
+            <w:r>
+              <w:rPr>
+                <w:rFonts w:ascii="Arial" w:hAnsi="Arial"/>
+                <w:b w:val="0"/>
+                <w:i w:val="0"/>
+                <w:sz w:val="20"/>
+              </w:rPr>
+              <w:t>0.159</w:t>
+            </w:r>
+          </w:p>
+        </w:tc>
+        <w:tc>
+          <w:tcPr>
+            <w:tcW w:type="dxa" w:w="1984"/>
+            <w:shd w:val="clear" w:color="auto" w:fill="FFFFFF"/>
+            <w:tcBorders>
+              <w:top w:val="single" w:sz="4" w:space="0" w:color="AAAAAA"/>
+              <w:left w:val="single" w:sz="4" w:space="0" w:color="AAAAAA"/>
+              <w:bottom w:val="single" w:sz="4" w:space="0" w:color="AAAAAA"/>
+              <w:right w:val="single" w:sz="4" w:space="0" w:color="AAAAAA"/>
+            </w:tcBorders>
+            <w:tcMar>
+              <w:top w:w="80" w:type="dxa"/>
+              <w:left w:w="80" w:type="dxa"/>
+              <w:bottom w:w="80" w:type="dxa"/>
+              <w:right w:w="80" w:type="dxa"/>
+            </w:tcMar>
+          </w:tcPr>
+          <w:p>
+            <w:r>
+              <w:rPr>
+                <w:rFonts w:ascii="Arial" w:hAnsi="Arial"/>
+                <w:b w:val="0"/>
+                <w:i w:val="0"/>
+                <w:sz w:val="20"/>
+              </w:rPr>
+              <w:t>Ampicillin</w:t>
+            </w:r>
+          </w:p>
+        </w:tc>
+        <w:tc>
+          <w:tcPr>
+            <w:tcW w:type="dxa" w:w="3798"/>
+            <w:shd w:val="clear" w:color="auto" w:fill="FFFFFF"/>
+            <w:tcBorders>
+              <w:top w:val="single" w:sz="4" w:space="0" w:color="AAAAAA"/>
+              <w:left w:val="single" w:sz="4" w:space="0" w:color="AAAAAA"/>
+              <w:bottom w:val="single" w:sz="4" w:space="0" w:color="AAAAAA"/>
+              <w:right w:val="single" w:sz="4" w:space="0" w:color="AAAAAA"/>
+            </w:tcBorders>
+            <w:tcMar>
+              <w:top w:w="80" w:type="dxa"/>
+              <w:left w:w="80" w:type="dxa"/>
+              <w:bottom w:w="80" w:type="dxa"/>
+              <w:right w:w="80" w:type="dxa"/>
+            </w:tcMar>
+          </w:tcPr>
+          <w:p>
+            <w:r>
+              <w:rPr>
+                <w:rFonts w:ascii="Arial" w:hAnsi="Arial"/>
+                <w:b w:val="0"/>
+                <w:i w:val="0"/>
+                <w:sz w:val="20"/>
+              </w:rPr>
+              <w:t>Lowest similarity in top 10 — most structurally novel</w:t>
+            </w:r>
+          </w:p>
+        </w:tc>
+      </w:tr>
+      <w:tr>
+        <w:tc>
+          <w:tcPr>
+            <w:tcW w:type="dxa" w:w="680"/>
+            <w:shd w:val="clear" w:color="auto" w:fill="D6E4F0"/>
+            <w:tcBorders>
+              <w:top w:val="single" w:sz="4" w:space="0" w:color="AAAAAA"/>
+              <w:left w:val="single" w:sz="4" w:space="0" w:color="AAAAAA"/>
+              <w:bottom w:val="single" w:sz="4" w:space="0" w:color="AAAAAA"/>
+              <w:right w:val="single" w:sz="4" w:space="0" w:color="AAAAAA"/>
+            </w:tcBorders>
+            <w:tcMar>
+              <w:top w:w="80" w:type="dxa"/>
+              <w:left w:w="80" w:type="dxa"/>
+              <w:bottom w:w="80" w:type="dxa"/>
+              <w:right w:w="80" w:type="dxa"/>
+            </w:tcMar>
+          </w:tcPr>
+          <w:p>
+            <w:r>
+              <w:rPr>
+                <w:rFonts w:ascii="Arial" w:hAnsi="Arial"/>
+                <w:b w:val="0"/>
+                <w:i w:val="0"/>
+                <w:sz w:val="20"/>
+              </w:rPr>
+              <w:t>4</w:t>
+            </w:r>
+          </w:p>
+        </w:tc>
+        <w:tc>
+          <w:tcPr>
+            <w:tcW w:type="dxa" w:w="1304"/>
+            <w:shd w:val="clear" w:color="auto" w:fill="D6E4F0"/>
+            <w:tcBorders>
+              <w:top w:val="single" w:sz="4" w:space="0" w:color="AAAAAA"/>
+              <w:left w:val="single" w:sz="4" w:space="0" w:color="AAAAAA"/>
+              <w:bottom w:val="single" w:sz="4" w:space="0" w:color="AAAAAA"/>
+              <w:right w:val="single" w:sz="4" w:space="0" w:color="AAAAAA"/>
+            </w:tcBorders>
+            <w:tcMar>
+              <w:top w:w="80" w:type="dxa"/>
+              <w:left w:w="80" w:type="dxa"/>
+              <w:bottom w:w="80" w:type="dxa"/>
+              <w:right w:w="80" w:type="dxa"/>
+            </w:tcMar>
+          </w:tcPr>
+          <w:p>
+            <w:r>
+              <w:rPr>
+                <w:rFonts w:ascii="Arial" w:hAnsi="Arial"/>
+                <w:b w:val="0"/>
+                <w:i w:val="0"/>
+                <w:sz w:val="20"/>
+              </w:rPr>
+              <w:t>0.986</w:t>
+            </w:r>
+          </w:p>
+        </w:tc>
+        <w:tc>
+          <w:tcPr>
+            <w:tcW w:type="dxa" w:w="1304"/>
+            <w:shd w:val="clear" w:color="auto" w:fill="D6E4F0"/>
+            <w:tcBorders>
+              <w:top w:val="single" w:sz="4" w:space="0" w:color="AAAAAA"/>
+              <w:left w:val="single" w:sz="4" w:space="0" w:color="AAAAAA"/>
+              <w:bottom w:val="single" w:sz="4" w:space="0" w:color="AAAAAA"/>
+              <w:right w:val="single" w:sz="4" w:space="0" w:color="AAAAAA"/>
+            </w:tcBorders>
+            <w:tcMar>
+              <w:top w:w="80" w:type="dxa"/>
+              <w:left w:w="80" w:type="dxa"/>
+              <w:bottom w:w="80" w:type="dxa"/>
+              <w:right w:w="80" w:type="dxa"/>
+            </w:tcMar>
+          </w:tcPr>
+          <w:p>
+            <w:r>
+              <w:rPr>
+                <w:rFonts w:ascii="Arial" w:hAnsi="Arial"/>
+                <w:b w:val="0"/>
+                <w:i w:val="0"/>
+                <w:sz w:val="20"/>
+              </w:rPr>
+              <w:t>0.173</w:t>
+            </w:r>
+          </w:p>
+        </w:tc>
+        <w:tc>
+          <w:tcPr>
+            <w:tcW w:type="dxa" w:w="1984"/>
+            <w:shd w:val="clear" w:color="auto" w:fill="D6E4F0"/>
+            <w:tcBorders>
+              <w:top w:val="single" w:sz="4" w:space="0" w:color="AAAAAA"/>
+              <w:left w:val="single" w:sz="4" w:space="0" w:color="AAAAAA"/>
+              <w:bottom w:val="single" w:sz="4" w:space="0" w:color="AAAAAA"/>
+              <w:right w:val="single" w:sz="4" w:space="0" w:color="AAAAAA"/>
+            </w:tcBorders>
+            <w:tcMar>
+              <w:top w:w="80" w:type="dxa"/>
+              <w:left w:w="80" w:type="dxa"/>
+              <w:bottom w:w="80" w:type="dxa"/>
+              <w:right w:w="80" w:type="dxa"/>
+            </w:tcMar>
+          </w:tcPr>
+          <w:p>
+            <w:r>
+              <w:rPr>
+                <w:rFonts w:ascii="Arial" w:hAnsi="Arial"/>
+                <w:b w:val="0"/>
+                <w:i w:val="0"/>
+                <w:sz w:val="20"/>
+              </w:rPr>
+              <w:t>Amoxicillin</w:t>
+            </w:r>
+          </w:p>
+        </w:tc>
+        <w:tc>
+          <w:tcPr>
+            <w:tcW w:type="dxa" w:w="3798"/>
+            <w:shd w:val="clear" w:color="auto" w:fill="D6E4F0"/>
+            <w:tcBorders>
+              <w:top w:val="single" w:sz="4" w:space="0" w:color="AAAAAA"/>
+              <w:left w:val="single" w:sz="4" w:space="0" w:color="AAAAAA"/>
+              <w:bottom w:val="single" w:sz="4" w:space="0" w:color="AAAAAA"/>
+              <w:right w:val="single" w:sz="4" w:space="0" w:color="AAAAAA"/>
+            </w:tcBorders>
+            <w:tcMar>
+              <w:top w:w="80" w:type="dxa"/>
+              <w:left w:w="80" w:type="dxa"/>
+              <w:bottom w:w="80" w:type="dxa"/>
+              <w:right w:w="80" w:type="dxa"/>
+            </w:tcMar>
+          </w:tcPr>
+          <w:p>
+            <w:r>
+              <w:rPr>
+                <w:rFonts w:ascii="Arial" w:hAnsi="Arial"/>
+                <w:b w:val="0"/>
+                <w:i w:val="0"/>
+                <w:sz w:val="20"/>
+              </w:rPr>
+              <w:t>Pivaloyloxymethyl ester prodrug motif; novel cephalosporin</w:t>
+            </w:r>
+          </w:p>
+        </w:tc>
+      </w:tr>
+      <w:tr>
+        <w:tc>
+          <w:tcPr>
+            <w:tcW w:type="dxa" w:w="680"/>
+            <w:shd w:val="clear" w:color="auto" w:fill="FFFFFF"/>
+            <w:tcBorders>
+              <w:top w:val="single" w:sz="4" w:space="0" w:color="AAAAAA"/>
+              <w:left w:val="single" w:sz="4" w:space="0" w:color="AAAAAA"/>
+              <w:bottom w:val="single" w:sz="4" w:space="0" w:color="AAAAAA"/>
+              <w:right w:val="single" w:sz="4" w:space="0" w:color="AAAAAA"/>
+            </w:tcBorders>
+            <w:tcMar>
+              <w:top w:w="80" w:type="dxa"/>
+              <w:left w:w="80" w:type="dxa"/>
+              <w:bottom w:w="80" w:type="dxa"/>
+              <w:right w:w="80" w:type="dxa"/>
+            </w:tcMar>
+          </w:tcPr>
+          <w:p>
+            <w:r>
+              <w:rPr>
+                <w:rFonts w:ascii="Arial" w:hAnsi="Arial"/>
+                <w:b w:val="0"/>
+                <w:i w:val="0"/>
+                <w:sz w:val="20"/>
+              </w:rPr>
+              <w:t>6</w:t>
+            </w:r>
+          </w:p>
+        </w:tc>
+        <w:tc>
+          <w:tcPr>
+            <w:tcW w:type="dxa" w:w="1304"/>
+            <w:shd w:val="clear" w:color="auto" w:fill="FFFFFF"/>
+            <w:tcBorders>
+              <w:top w:val="single" w:sz="4" w:space="0" w:color="AAAAAA"/>
+              <w:left w:val="single" w:sz="4" w:space="0" w:color="AAAAAA"/>
+              <w:bottom w:val="single" w:sz="4" w:space="0" w:color="AAAAAA"/>
+              <w:right w:val="single" w:sz="4" w:space="0" w:color="AAAAAA"/>
+            </w:tcBorders>
+            <w:tcMar>
+              <w:top w:w="80" w:type="dxa"/>
+              <w:left w:w="80" w:type="dxa"/>
+              <w:bottom w:w="80" w:type="dxa"/>
+              <w:right w:w="80" w:type="dxa"/>
+            </w:tcMar>
+          </w:tcPr>
+          <w:p>
+            <w:r>
+              <w:rPr>
+                <w:rFonts w:ascii="Arial" w:hAnsi="Arial"/>
+                <w:b w:val="0"/>
+                <w:i w:val="0"/>
+                <w:sz w:val="20"/>
+              </w:rPr>
+              <w:t>0.985</w:t>
+            </w:r>
+          </w:p>
+        </w:tc>
+        <w:tc>
+          <w:tcPr>
+            <w:tcW w:type="dxa" w:w="1304"/>
+            <w:shd w:val="clear" w:color="auto" w:fill="FFFFFF"/>
+            <w:tcBorders>
+              <w:top w:val="single" w:sz="4" w:space="0" w:color="AAAAAA"/>
+              <w:left w:val="single" w:sz="4" w:space="0" w:color="AAAAAA"/>
+              <w:bottom w:val="single" w:sz="4" w:space="0" w:color="AAAAAA"/>
+              <w:right w:val="single" w:sz="4" w:space="0" w:color="AAAAAA"/>
+            </w:tcBorders>
+            <w:tcMar>
+              <w:top w:w="80" w:type="dxa"/>
+              <w:left w:w="80" w:type="dxa"/>
+              <w:bottom w:w="80" w:type="dxa"/>
+              <w:right w:w="80" w:type="dxa"/>
+            </w:tcMar>
+          </w:tcPr>
+          <w:p>
+            <w:r>
+              <w:rPr>
+                <w:rFonts w:ascii="Arial" w:hAnsi="Arial"/>
+                <w:b w:val="0"/>
+                <w:i w:val="0"/>
+                <w:sz w:val="20"/>
+              </w:rPr>
+              <w:t>0.291</w:t>
+            </w:r>
+          </w:p>
+        </w:tc>
+        <w:tc>
+          <w:tcPr>
+            <w:tcW w:type="dxa" w:w="1984"/>
+            <w:shd w:val="clear" w:color="auto" w:fill="FFFFFF"/>
+            <w:tcBorders>
+              <w:top w:val="single" w:sz="4" w:space="0" w:color="AAAAAA"/>
+              <w:left w:val="single" w:sz="4" w:space="0" w:color="AAAAAA"/>
+              <w:bottom w:val="single" w:sz="4" w:space="0" w:color="AAAAAA"/>
+              <w:right w:val="single" w:sz="4" w:space="0" w:color="AAAAAA"/>
+            </w:tcBorders>
+            <w:tcMar>
+              <w:top w:w="80" w:type="dxa"/>
+              <w:left w:w="80" w:type="dxa"/>
+              <w:bottom w:w="80" w:type="dxa"/>
+              <w:right w:w="80" w:type="dxa"/>
+            </w:tcMar>
+          </w:tcPr>
+          <w:p>
+            <w:r>
+              <w:rPr>
+                <w:rFonts w:ascii="Arial" w:hAnsi="Arial"/>
+                <w:b w:val="0"/>
+                <w:i w:val="0"/>
+                <w:sz w:val="20"/>
+              </w:rPr>
+              <w:t>Ampicillin</w:t>
+            </w:r>
+          </w:p>
+        </w:tc>
+        <w:tc>
+          <w:tcPr>
+            <w:tcW w:type="dxa" w:w="3798"/>
+            <w:shd w:val="clear" w:color="auto" w:fill="FFFFFF"/>
+            <w:tcBorders>
+              <w:top w:val="single" w:sz="4" w:space="0" w:color="AAAAAA"/>
+              <w:left w:val="single" w:sz="4" w:space="0" w:color="AAAAAA"/>
+              <w:bottom w:val="single" w:sz="4" w:space="0" w:color="AAAAAA"/>
+              <w:right w:val="single" w:sz="4" w:space="0" w:color="AAAAAA"/>
+            </w:tcBorders>
+            <w:tcMar>
+              <w:top w:w="80" w:type="dxa"/>
+              <w:left w:w="80" w:type="dxa"/>
+              <w:bottom w:w="80" w:type="dxa"/>
+              <w:right w:w="80" w:type="dxa"/>
+            </w:tcMar>
+          </w:tcPr>
+          <w:p>
+            <w:r>
+              <w:rPr>
+                <w:rFonts w:ascii="Arial" w:hAnsi="Arial"/>
+                <w:b w:val="0"/>
+                <w:i w:val="0"/>
+                <w:sz w:val="20"/>
+              </w:rPr>
+              <w:t>Tetrazolethio-cephem sodium salt</w:t>
+            </w:r>
+          </w:p>
+        </w:tc>
+      </w:tr>
+      <w:tr>
+        <w:tc>
+          <w:tcPr>
+            <w:tcW w:type="dxa" w:w="680"/>
+            <w:shd w:val="clear" w:color="auto" w:fill="D6E4F0"/>
+            <w:tcBorders>
+              <w:top w:val="single" w:sz="4" w:space="0" w:color="AAAAAA"/>
+              <w:left w:val="single" w:sz="4" w:space="0" w:color="AAAAAA"/>
+              <w:bottom w:val="single" w:sz="4" w:space="0" w:color="AAAAAA"/>
+              <w:right w:val="single" w:sz="4" w:space="0" w:color="AAAAAA"/>
+            </w:tcBorders>
+            <w:tcMar>
+              <w:top w:w="80" w:type="dxa"/>
+              <w:left w:w="80" w:type="dxa"/>
+              <w:bottom w:w="80" w:type="dxa"/>
+              <w:right w:w="80" w:type="dxa"/>
+            </w:tcMar>
+          </w:tcPr>
+          <w:p>
+            <w:r>
+              <w:rPr>
+                <w:rFonts w:ascii="Arial" w:hAnsi="Arial"/>
+                <w:b w:val="0"/>
+                <w:i w:val="0"/>
+                <w:sz w:val="20"/>
+              </w:rPr>
+              <w:t>8</w:t>
+            </w:r>
+          </w:p>
+        </w:tc>
+        <w:tc>
+          <w:tcPr>
+            <w:tcW w:type="dxa" w:w="1304"/>
+            <w:shd w:val="clear" w:color="auto" w:fill="D6E4F0"/>
+            <w:tcBorders>
+              <w:top w:val="single" w:sz="4" w:space="0" w:color="AAAAAA"/>
+              <w:left w:val="single" w:sz="4" w:space="0" w:color="AAAAAA"/>
+              <w:bottom w:val="single" w:sz="4" w:space="0" w:color="AAAAAA"/>
+              <w:right w:val="single" w:sz="4" w:space="0" w:color="AAAAAA"/>
+            </w:tcBorders>
+            <w:tcMar>
+              <w:top w:w="80" w:type="dxa"/>
+              <w:left w:w="80" w:type="dxa"/>
+              <w:bottom w:w="80" w:type="dxa"/>
+              <w:right w:w="80" w:type="dxa"/>
+            </w:tcMar>
+          </w:tcPr>
+          <w:p>
+            <w:r>
+              <w:rPr>
+                <w:rFonts w:ascii="Arial" w:hAnsi="Arial"/>
+                <w:b w:val="0"/>
+                <w:i w:val="0"/>
+                <w:sz w:val="20"/>
+              </w:rPr>
+              <w:t>0.958</w:t>
+            </w:r>
+          </w:p>
+        </w:tc>
+        <w:tc>
+          <w:tcPr>
+            <w:tcW w:type="dxa" w:w="1304"/>
+            <w:shd w:val="clear" w:color="auto" w:fill="D6E4F0"/>
+            <w:tcBorders>
+              <w:top w:val="single" w:sz="4" w:space="0" w:color="AAAAAA"/>
+              <w:left w:val="single" w:sz="4" w:space="0" w:color="AAAAAA"/>
+              <w:bottom w:val="single" w:sz="4" w:space="0" w:color="AAAAAA"/>
+              <w:right w:val="single" w:sz="4" w:space="0" w:color="AAAAAA"/>
+            </w:tcBorders>
+            <w:tcMar>
+              <w:top w:w="80" w:type="dxa"/>
+              <w:left w:w="80" w:type="dxa"/>
+              <w:bottom w:w="80" w:type="dxa"/>
+              <w:right w:w="80" w:type="dxa"/>
+            </w:tcMar>
+          </w:tcPr>
+          <w:p>
+            <w:r>
+              <w:rPr>
+                <w:rFonts w:ascii="Arial" w:hAnsi="Arial"/>
+                <w:b w:val="0"/>
+                <w:i w:val="0"/>
+                <w:sz w:val="20"/>
+              </w:rPr>
+              <w:t>0.270</w:t>
+            </w:r>
+          </w:p>
+        </w:tc>
+        <w:tc>
+          <w:tcPr>
+            <w:tcW w:type="dxa" w:w="1984"/>
+            <w:shd w:val="clear" w:color="auto" w:fill="D6E4F0"/>
+            <w:tcBorders>
+              <w:top w:val="single" w:sz="4" w:space="0" w:color="AAAAAA"/>
+              <w:left w:val="single" w:sz="4" w:space="0" w:color="AAAAAA"/>
+              <w:bottom w:val="single" w:sz="4" w:space="0" w:color="AAAAAA"/>
+              <w:right w:val="single" w:sz="4" w:space="0" w:color="AAAAAA"/>
+            </w:tcBorders>
+            <w:tcMar>
+              <w:top w:w="80" w:type="dxa"/>
+              <w:left w:w="80" w:type="dxa"/>
+              <w:bottom w:w="80" w:type="dxa"/>
+              <w:right w:w="80" w:type="dxa"/>
+            </w:tcMar>
+          </w:tcPr>
+          <w:p>
+            <w:r>
+              <w:rPr>
+                <w:rFonts w:ascii="Arial" w:hAnsi="Arial"/>
+                <w:b w:val="0"/>
+                <w:i w:val="0"/>
+                <w:sz w:val="20"/>
+              </w:rPr>
+              <w:t>Amoxicillin</w:t>
+            </w:r>
+          </w:p>
+        </w:tc>
+        <w:tc>
+          <w:tcPr>
+            <w:tcW w:type="dxa" w:w="3798"/>
+            <w:shd w:val="clear" w:color="auto" w:fill="D6E4F0"/>
+            <w:tcBorders>
+              <w:top w:val="single" w:sz="4" w:space="0" w:color="AAAAAA"/>
+              <w:left w:val="single" w:sz="4" w:space="0" w:color="AAAAAA"/>
+              <w:bottom w:val="single" w:sz="4" w:space="0" w:color="AAAAAA"/>
+              <w:right w:val="single" w:sz="4" w:space="0" w:color="AAAAAA"/>
+            </w:tcBorders>
+            <w:tcMar>
+              <w:top w:w="80" w:type="dxa"/>
+              <w:left w:w="80" w:type="dxa"/>
+              <w:bottom w:w="80" w:type="dxa"/>
+              <w:right w:w="80" w:type="dxa"/>
+            </w:tcMar>
+          </w:tcPr>
+          <w:p>
+            <w:r>
+              <w:rPr>
+                <w:rFonts w:ascii="Arial" w:hAnsi="Arial"/>
+                <w:b w:val="0"/>
+                <w:i w:val="0"/>
+                <w:sz w:val="20"/>
+              </w:rPr>
+              <w:t>Phenolic acyl sidechain; structurally unusual beta-lactam</w:t>
+            </w:r>
+          </w:p>
+        </w:tc>
+      </w:tr>
+      <w:tr>
+        <w:tc>
+          <w:tcPr>
+            <w:tcW w:type="dxa" w:w="680"/>
+            <w:shd w:val="clear" w:color="auto" w:fill="FFFFFF"/>
+            <w:tcBorders>
+              <w:top w:val="single" w:sz="4" w:space="0" w:color="AAAAAA"/>
+              <w:left w:val="single" w:sz="4" w:space="0" w:color="AAAAAA"/>
+              <w:bottom w:val="single" w:sz="4" w:space="0" w:color="AAAAAA"/>
+              <w:right w:val="single" w:sz="4" w:space="0" w:color="AAAAAA"/>
+            </w:tcBorders>
+            <w:tcMar>
+              <w:top w:w="80" w:type="dxa"/>
+              <w:left w:w="80" w:type="dxa"/>
+              <w:bottom w:w="80" w:type="dxa"/>
+              <w:right w:w="80" w:type="dxa"/>
+            </w:tcMar>
+          </w:tcPr>
+          <w:p>
+            <w:r>
+              <w:rPr>
+                <w:rFonts w:ascii="Arial" w:hAnsi="Arial"/>
+                <w:b w:val="0"/>
+                <w:i w:val="0"/>
+                <w:sz w:val="20"/>
+              </w:rPr>
+              <w:t>9</w:t>
+            </w:r>
+          </w:p>
+        </w:tc>
+        <w:tc>
+          <w:tcPr>
+            <w:tcW w:type="dxa" w:w="1304"/>
+            <w:shd w:val="clear" w:color="auto" w:fill="FFFFFF"/>
+            <w:tcBorders>
+              <w:top w:val="single" w:sz="4" w:space="0" w:color="AAAAAA"/>
+              <w:left w:val="single" w:sz="4" w:space="0" w:color="AAAAAA"/>
+              <w:bottom w:val="single" w:sz="4" w:space="0" w:color="AAAAAA"/>
+              <w:right w:val="single" w:sz="4" w:space="0" w:color="AAAAAA"/>
+            </w:tcBorders>
+            <w:tcMar>
+              <w:top w:w="80" w:type="dxa"/>
+              <w:left w:w="80" w:type="dxa"/>
+              <w:bottom w:w="80" w:type="dxa"/>
+              <w:right w:w="80" w:type="dxa"/>
+            </w:tcMar>
+          </w:tcPr>
+          <w:p>
+            <w:r>
+              <w:rPr>
+                <w:rFonts w:ascii="Arial" w:hAnsi="Arial"/>
+                <w:b w:val="0"/>
+                <w:i w:val="0"/>
+                <w:sz w:val="20"/>
+              </w:rPr>
+              <w:t>0.950</w:t>
+            </w:r>
+          </w:p>
+        </w:tc>
+        <w:tc>
+          <w:tcPr>
+            <w:tcW w:type="dxa" w:w="1304"/>
+            <w:shd w:val="clear" w:color="auto" w:fill="FFFFFF"/>
+            <w:tcBorders>
+              <w:top w:val="single" w:sz="4" w:space="0" w:color="AAAAAA"/>
+              <w:left w:val="single" w:sz="4" w:space="0" w:color="AAAAAA"/>
+              <w:bottom w:val="single" w:sz="4" w:space="0" w:color="AAAAAA"/>
+              <w:right w:val="single" w:sz="4" w:space="0" w:color="AAAAAA"/>
+            </w:tcBorders>
+            <w:tcMar>
+              <w:top w:w="80" w:type="dxa"/>
+              <w:left w:w="80" w:type="dxa"/>
+              <w:bottom w:w="80" w:type="dxa"/>
+              <w:right w:w="80" w:type="dxa"/>
+            </w:tcMar>
+          </w:tcPr>
+          <w:p>
+            <w:r>
+              <w:rPr>
+                <w:rFonts w:ascii="Arial" w:hAnsi="Arial"/>
+                <w:b w:val="0"/>
+                <w:i w:val="0"/>
+                <w:sz w:val="20"/>
+              </w:rPr>
+              <w:t>0.126</w:t>
+            </w:r>
+          </w:p>
+        </w:tc>
+        <w:tc>
+          <w:tcPr>
+            <w:tcW w:type="dxa" w:w="1984"/>
+            <w:shd w:val="clear" w:color="auto" w:fill="FFFFFF"/>
+            <w:tcBorders>
+              <w:top w:val="single" w:sz="4" w:space="0" w:color="AAAAAA"/>
+              <w:left w:val="single" w:sz="4" w:space="0" w:color="AAAAAA"/>
+              <w:bottom w:val="single" w:sz="4" w:space="0" w:color="AAAAAA"/>
+              <w:right w:val="single" w:sz="4" w:space="0" w:color="AAAAAA"/>
+            </w:tcBorders>
+            <w:tcMar>
+              <w:top w:w="80" w:type="dxa"/>
+              <w:left w:w="80" w:type="dxa"/>
+              <w:bottom w:w="80" w:type="dxa"/>
+              <w:right w:w="80" w:type="dxa"/>
+            </w:tcMar>
+          </w:tcPr>
+          <w:p>
+            <w:r>
+              <w:rPr>
+                <w:rFonts w:ascii="Arial" w:hAnsi="Arial"/>
+                <w:b w:val="0"/>
+                <w:i w:val="0"/>
+                <w:sz w:val="20"/>
+              </w:rPr>
+              <w:t>Ampicillin</w:t>
+            </w:r>
+          </w:p>
+        </w:tc>
+        <w:tc>
+          <w:tcPr>
+            <w:tcW w:type="dxa" w:w="3798"/>
+            <w:shd w:val="clear" w:color="auto" w:fill="FFFFFF"/>
+            <w:tcBorders>
+              <w:top w:val="single" w:sz="4" w:space="0" w:color="AAAAAA"/>
+              <w:left w:val="single" w:sz="4" w:space="0" w:color="AAAAAA"/>
+              <w:bottom w:val="single" w:sz="4" w:space="0" w:color="AAAAAA"/>
+              <w:right w:val="single" w:sz="4" w:space="0" w:color="AAAAAA"/>
+            </w:tcBorders>
+            <w:tcMar>
+              <w:top w:w="80" w:type="dxa"/>
+              <w:left w:w="80" w:type="dxa"/>
+              <w:bottom w:w="80" w:type="dxa"/>
+              <w:right w:w="80" w:type="dxa"/>
+            </w:tcMar>
+          </w:tcPr>
+          <w:p>
+            <w:r>
+              <w:rPr>
+                <w:rFonts w:ascii="Arial" w:hAnsi="Arial"/>
+                <w:b w:val="0"/>
+                <w:i w:val="0"/>
+                <w:sz w:val="20"/>
+              </w:rPr>
+              <w:t>Lowest similarity in the entire top 50</w:t>
+            </w:r>
+          </w:p>
+        </w:tc>
+      </w:tr>
+      <w:tr>
+        <w:tc>
+          <w:tcPr>
+            <w:tcW w:type="dxa" w:w="680"/>
+            <w:shd w:val="clear" w:color="auto" w:fill="D6E4F0"/>
+            <w:tcBorders>
+              <w:top w:val="single" w:sz="4" w:space="0" w:color="AAAAAA"/>
+              <w:left w:val="single" w:sz="4" w:space="0" w:color="AAAAAA"/>
+              <w:bottom w:val="single" w:sz="4" w:space="0" w:color="AAAAAA"/>
+              <w:right w:val="single" w:sz="4" w:space="0" w:color="AAAAAA"/>
+            </w:tcBorders>
+            <w:tcMar>
+              <w:top w:w="80" w:type="dxa"/>
+              <w:left w:w="80" w:type="dxa"/>
+              <w:bottom w:w="80" w:type="dxa"/>
+              <w:right w:w="80" w:type="dxa"/>
+            </w:tcMar>
+          </w:tcPr>
+          <w:p>
+            <w:r>
+              <w:rPr>
+                <w:rFonts w:ascii="Arial" w:hAnsi="Arial"/>
+                <w:b w:val="0"/>
+                <w:i w:val="0"/>
+                <w:sz w:val="20"/>
+              </w:rPr>
+              <w:t>11</w:t>
+            </w:r>
+          </w:p>
+        </w:tc>
+        <w:tc>
+          <w:tcPr>
+            <w:tcW w:type="dxa" w:w="1304"/>
+            <w:shd w:val="clear" w:color="auto" w:fill="D6E4F0"/>
+            <w:tcBorders>
+              <w:top w:val="single" w:sz="4" w:space="0" w:color="AAAAAA"/>
+              <w:left w:val="single" w:sz="4" w:space="0" w:color="AAAAAA"/>
+              <w:bottom w:val="single" w:sz="4" w:space="0" w:color="AAAAAA"/>
+              <w:right w:val="single" w:sz="4" w:space="0" w:color="AAAAAA"/>
+            </w:tcBorders>
+            <w:tcMar>
+              <w:top w:w="80" w:type="dxa"/>
+              <w:left w:w="80" w:type="dxa"/>
+              <w:bottom w:w="80" w:type="dxa"/>
+              <w:right w:w="80" w:type="dxa"/>
+            </w:tcMar>
+          </w:tcPr>
+          <w:p>
+            <w:r>
+              <w:rPr>
+                <w:rFonts w:ascii="Arial" w:hAnsi="Arial"/>
+                <w:b w:val="0"/>
+                <w:i w:val="0"/>
+                <w:sz w:val="20"/>
+              </w:rPr>
+              <w:t>0.905</w:t>
+            </w:r>
+          </w:p>
+        </w:tc>
+        <w:tc>
+          <w:tcPr>
+            <w:tcW w:type="dxa" w:w="1304"/>
+            <w:shd w:val="clear" w:color="auto" w:fill="D6E4F0"/>
+            <w:tcBorders>
+              <w:top w:val="single" w:sz="4" w:space="0" w:color="AAAAAA"/>
+              <w:left w:val="single" w:sz="4" w:space="0" w:color="AAAAAA"/>
+              <w:bottom w:val="single" w:sz="4" w:space="0" w:color="AAAAAA"/>
+              <w:right w:val="single" w:sz="4" w:space="0" w:color="AAAAAA"/>
+            </w:tcBorders>
+            <w:tcMar>
+              <w:top w:w="80" w:type="dxa"/>
+              <w:left w:w="80" w:type="dxa"/>
+              <w:bottom w:w="80" w:type="dxa"/>
+              <w:right w:w="80" w:type="dxa"/>
+            </w:tcMar>
+          </w:tcPr>
+          <w:p>
+            <w:r>
+              <w:rPr>
+                <w:rFonts w:ascii="Arial" w:hAnsi="Arial"/>
+                <w:b w:val="0"/>
+                <w:i w:val="0"/>
+                <w:sz w:val="20"/>
+              </w:rPr>
+              <w:t>0.261</w:t>
+            </w:r>
+          </w:p>
+        </w:tc>
+        <w:tc>
+          <w:tcPr>
+            <w:tcW w:type="dxa" w:w="1984"/>
+            <w:shd w:val="clear" w:color="auto" w:fill="D6E4F0"/>
+            <w:tcBorders>
+              <w:top w:val="single" w:sz="4" w:space="0" w:color="AAAAAA"/>
+              <w:left w:val="single" w:sz="4" w:space="0" w:color="AAAAAA"/>
+              <w:bottom w:val="single" w:sz="4" w:space="0" w:color="AAAAAA"/>
+              <w:right w:val="single" w:sz="4" w:space="0" w:color="AAAAAA"/>
+            </w:tcBorders>
+            <w:tcMar>
+              <w:top w:w="80" w:type="dxa"/>
+              <w:left w:w="80" w:type="dxa"/>
+              <w:bottom w:w="80" w:type="dxa"/>
+              <w:right w:w="80" w:type="dxa"/>
+            </w:tcMar>
+          </w:tcPr>
+          <w:p>
+            <w:r>
+              <w:rPr>
+                <w:rFonts w:ascii="Arial" w:hAnsi="Arial"/>
+                <w:b w:val="0"/>
+                <w:i w:val="0"/>
+                <w:sz w:val="20"/>
+              </w:rPr>
+              <w:t>Ampicillin</w:t>
+            </w:r>
+          </w:p>
+        </w:tc>
+        <w:tc>
+          <w:tcPr>
+            <w:tcW w:type="dxa" w:w="3798"/>
+            <w:shd w:val="clear" w:color="auto" w:fill="D6E4F0"/>
+            <w:tcBorders>
+              <w:top w:val="single" w:sz="4" w:space="0" w:color="AAAAAA"/>
+              <w:left w:val="single" w:sz="4" w:space="0" w:color="AAAAAA"/>
+              <w:bottom w:val="single" w:sz="4" w:space="0" w:color="AAAAAA"/>
+              <w:right w:val="single" w:sz="4" w:space="0" w:color="AAAAAA"/>
+            </w:tcBorders>
+            <w:tcMar>
+              <w:top w:w="80" w:type="dxa"/>
+              <w:left w:w="80" w:type="dxa"/>
+              <w:bottom w:w="80" w:type="dxa"/>
+              <w:right w:w="80" w:type="dxa"/>
+            </w:tcMar>
+          </w:tcPr>
+          <w:p>
+            <w:r>
+              <w:rPr>
+                <w:rFonts w:ascii="Arial" w:hAnsi="Arial"/>
+                <w:b w:val="0"/>
+                <w:i w:val="0"/>
+                <w:sz w:val="20"/>
+              </w:rPr>
+              <w:t>Sulfonylmethyl-tetrazole cephem</w:t>
+            </w:r>
+          </w:p>
+        </w:tc>
+      </w:tr>
+      <w:tr>
+        <w:tc>
+          <w:tcPr>
+            <w:tcW w:type="dxa" w:w="680"/>
+            <w:shd w:val="clear" w:color="auto" w:fill="FFFFFF"/>
+            <w:tcBorders>
+              <w:top w:val="single" w:sz="4" w:space="0" w:color="AAAAAA"/>
+              <w:left w:val="single" w:sz="4" w:space="0" w:color="AAAAAA"/>
+              <w:bottom w:val="single" w:sz="4" w:space="0" w:color="AAAAAA"/>
+              <w:right w:val="single" w:sz="4" w:space="0" w:color="AAAAAA"/>
+            </w:tcBorders>
+            <w:tcMar>
+              <w:top w:w="80" w:type="dxa"/>
+              <w:left w:w="80" w:type="dxa"/>
+              <w:bottom w:w="80" w:type="dxa"/>
+              <w:right w:w="80" w:type="dxa"/>
+            </w:tcMar>
+          </w:tcPr>
+          <w:p>
+            <w:r>
+              <w:rPr>
+                <w:rFonts w:ascii="Arial" w:hAnsi="Arial"/>
+                <w:b w:val="0"/>
+                <w:i w:val="0"/>
+                <w:sz w:val="20"/>
+              </w:rPr>
+              <w:t>15</w:t>
+            </w:r>
+          </w:p>
+        </w:tc>
+        <w:tc>
+          <w:tcPr>
+            <w:tcW w:type="dxa" w:w="1304"/>
+            <w:shd w:val="clear" w:color="auto" w:fill="FFFFFF"/>
+            <w:tcBorders>
+              <w:top w:val="single" w:sz="4" w:space="0" w:color="AAAAAA"/>
+              <w:left w:val="single" w:sz="4" w:space="0" w:color="AAAAAA"/>
+              <w:bottom w:val="single" w:sz="4" w:space="0" w:color="AAAAAA"/>
+              <w:right w:val="single" w:sz="4" w:space="0" w:color="AAAAAA"/>
+            </w:tcBorders>
+            <w:tcMar>
+              <w:top w:w="80" w:type="dxa"/>
+              <w:left w:w="80" w:type="dxa"/>
+              <w:bottom w:w="80" w:type="dxa"/>
+              <w:right w:w="80" w:type="dxa"/>
+            </w:tcMar>
+          </w:tcPr>
+          <w:p>
+            <w:r>
+              <w:rPr>
+                <w:rFonts w:ascii="Arial" w:hAnsi="Arial"/>
+                <w:b w:val="0"/>
+                <w:i w:val="0"/>
+                <w:sz w:val="20"/>
+              </w:rPr>
+              <w:t>0.834</w:t>
+            </w:r>
+          </w:p>
+        </w:tc>
+        <w:tc>
+          <w:tcPr>
+            <w:tcW w:type="dxa" w:w="1304"/>
+            <w:shd w:val="clear" w:color="auto" w:fill="FFFFFF"/>
+            <w:tcBorders>
+              <w:top w:val="single" w:sz="4" w:space="0" w:color="AAAAAA"/>
+              <w:left w:val="single" w:sz="4" w:space="0" w:color="AAAAAA"/>
+              <w:bottom w:val="single" w:sz="4" w:space="0" w:color="AAAAAA"/>
+              <w:right w:val="single" w:sz="4" w:space="0" w:color="AAAAAA"/>
+            </w:tcBorders>
+            <w:tcMar>
+              <w:top w:w="80" w:type="dxa"/>
+              <w:left w:w="80" w:type="dxa"/>
+              <w:bottom w:w="80" w:type="dxa"/>
+              <w:right w:w="80" w:type="dxa"/>
+            </w:tcMar>
+          </w:tcPr>
+          <w:p>
+            <w:r>
+              <w:rPr>
+                <w:rFonts w:ascii="Arial" w:hAnsi="Arial"/>
+                <w:b w:val="0"/>
+                <w:i w:val="0"/>
+                <w:sz w:val="20"/>
+              </w:rPr>
+              <w:t>0.214</w:t>
+            </w:r>
+          </w:p>
+        </w:tc>
+        <w:tc>
+          <w:tcPr>
+            <w:tcW w:type="dxa" w:w="1984"/>
+            <w:shd w:val="clear" w:color="auto" w:fill="FFFFFF"/>
+            <w:tcBorders>
+              <w:top w:val="single" w:sz="4" w:space="0" w:color="AAAAAA"/>
+              <w:left w:val="single" w:sz="4" w:space="0" w:color="AAAAAA"/>
+              <w:bottom w:val="single" w:sz="4" w:space="0" w:color="AAAAAA"/>
+              <w:right w:val="single" w:sz="4" w:space="0" w:color="AAAAAA"/>
+            </w:tcBorders>
+            <w:tcMar>
+              <w:top w:w="80" w:type="dxa"/>
+              <w:left w:w="80" w:type="dxa"/>
+              <w:bottom w:w="80" w:type="dxa"/>
+              <w:right w:w="80" w:type="dxa"/>
+            </w:tcMar>
+          </w:tcPr>
+          <w:p>
+            <w:r>
+              <w:rPr>
+                <w:rFonts w:ascii="Arial" w:hAnsi="Arial"/>
+                <w:b w:val="0"/>
+                <w:i w:val="0"/>
+                <w:sz w:val="20"/>
+              </w:rPr>
+              <w:t>Ampicillin</w:t>
+            </w:r>
+          </w:p>
+        </w:tc>
+        <w:tc>
+          <w:tcPr>
+            <w:tcW w:type="dxa" w:w="3798"/>
+            <w:shd w:val="clear" w:color="auto" w:fill="FFFFFF"/>
+            <w:tcBorders>
+              <w:top w:val="single" w:sz="4" w:space="0" w:color="AAAAAA"/>
+              <w:left w:val="single" w:sz="4" w:space="0" w:color="AAAAAA"/>
+              <w:bottom w:val="single" w:sz="4" w:space="0" w:color="AAAAAA"/>
+              <w:right w:val="single" w:sz="4" w:space="0" w:color="AAAAAA"/>
+            </w:tcBorders>
+            <w:tcMar>
+              <w:top w:w="80" w:type="dxa"/>
+              <w:left w:w="80" w:type="dxa"/>
+              <w:bottom w:w="80" w:type="dxa"/>
+              <w:right w:w="80" w:type="dxa"/>
+            </w:tcMar>
+          </w:tcPr>
+          <w:p>
+            <w:r>
+              <w:rPr>
+                <w:rFonts w:ascii="Arial" w:hAnsi="Arial"/>
+                <w:b w:val="0"/>
+                <w:i w:val="0"/>
+                <w:sz w:val="20"/>
+              </w:rPr>
+              <w:t>Aminothiazole vinyl cephem; unsaturated side chain</w:t>
+            </w:r>
+          </w:p>
+        </w:tc>
+      </w:tr>
+      <w:tr>
+        <w:tc>
+          <w:tcPr>
+            <w:tcW w:type="dxa" w:w="680"/>
+            <w:shd w:val="clear" w:color="auto" w:fill="D6E4F0"/>
+            <w:tcBorders>
+              <w:top w:val="single" w:sz="4" w:space="0" w:color="AAAAAA"/>
+              <w:left w:val="single" w:sz="4" w:space="0" w:color="AAAAAA"/>
+              <w:bottom w:val="single" w:sz="4" w:space="0" w:color="AAAAAA"/>
+              <w:right w:val="single" w:sz="4" w:space="0" w:color="AAAAAA"/>
+            </w:tcBorders>
+            <w:tcMar>
+              <w:top w:w="80" w:type="dxa"/>
+              <w:left w:w="80" w:type="dxa"/>
+              <w:bottom w:w="80" w:type="dxa"/>
+              <w:right w:w="80" w:type="dxa"/>
+            </w:tcMar>
+          </w:tcPr>
+          <w:p>
+            <w:r>
+              <w:rPr>
+                <w:rFonts w:ascii="Arial" w:hAnsi="Arial"/>
+                <w:b w:val="0"/>
+                <w:i w:val="0"/>
+                <w:sz w:val="20"/>
+              </w:rPr>
+              <w:t>18</w:t>
+            </w:r>
+          </w:p>
+        </w:tc>
+        <w:tc>
+          <w:tcPr>
+            <w:tcW w:type="dxa" w:w="1304"/>
+            <w:shd w:val="clear" w:color="auto" w:fill="D6E4F0"/>
+            <w:tcBorders>
+              <w:top w:val="single" w:sz="4" w:space="0" w:color="AAAAAA"/>
+              <w:left w:val="single" w:sz="4" w:space="0" w:color="AAAAAA"/>
+              <w:bottom w:val="single" w:sz="4" w:space="0" w:color="AAAAAA"/>
+              <w:right w:val="single" w:sz="4" w:space="0" w:color="AAAAAA"/>
+            </w:tcBorders>
+            <w:tcMar>
+              <w:top w:w="80" w:type="dxa"/>
+              <w:left w:w="80" w:type="dxa"/>
+              <w:bottom w:w="80" w:type="dxa"/>
+              <w:right w:w="80" w:type="dxa"/>
+            </w:tcMar>
+          </w:tcPr>
+          <w:p>
+            <w:r>
+              <w:rPr>
+                <w:rFonts w:ascii="Arial" w:hAnsi="Arial"/>
+                <w:b w:val="0"/>
+                <w:i w:val="0"/>
+                <w:sz w:val="20"/>
+              </w:rPr>
+              <w:t>0.584</w:t>
+            </w:r>
+          </w:p>
+        </w:tc>
+        <w:tc>
+          <w:tcPr>
+            <w:tcW w:type="dxa" w:w="1304"/>
+            <w:shd w:val="clear" w:color="auto" w:fill="D6E4F0"/>
+            <w:tcBorders>
+              <w:top w:val="single" w:sz="4" w:space="0" w:color="AAAAAA"/>
+              <w:left w:val="single" w:sz="4" w:space="0" w:color="AAAAAA"/>
+              <w:bottom w:val="single" w:sz="4" w:space="0" w:color="AAAAAA"/>
+              <w:right w:val="single" w:sz="4" w:space="0" w:color="AAAAAA"/>
+            </w:tcBorders>
+            <w:tcMar>
+              <w:top w:w="80" w:type="dxa"/>
+              <w:left w:w="80" w:type="dxa"/>
+              <w:bottom w:w="80" w:type="dxa"/>
+              <w:right w:w="80" w:type="dxa"/>
+            </w:tcMar>
+          </w:tcPr>
+          <w:p>
+            <w:r>
+              <w:rPr>
+                <w:rFonts w:ascii="Arial" w:hAnsi="Arial"/>
+                <w:b w:val="0"/>
+                <w:i w:val="0"/>
+                <w:sz w:val="20"/>
+              </w:rPr>
+              <w:t>0.220</w:t>
+            </w:r>
+          </w:p>
+        </w:tc>
+        <w:tc>
+          <w:tcPr>
+            <w:tcW w:type="dxa" w:w="1984"/>
+            <w:shd w:val="clear" w:color="auto" w:fill="D6E4F0"/>
+            <w:tcBorders>
+              <w:top w:val="single" w:sz="4" w:space="0" w:color="AAAAAA"/>
+              <w:left w:val="single" w:sz="4" w:space="0" w:color="AAAAAA"/>
+              <w:bottom w:val="single" w:sz="4" w:space="0" w:color="AAAAAA"/>
+              <w:right w:val="single" w:sz="4" w:space="0" w:color="AAAAAA"/>
+            </w:tcBorders>
+            <w:tcMar>
+              <w:top w:w="80" w:type="dxa"/>
+              <w:left w:w="80" w:type="dxa"/>
+              <w:bottom w:w="80" w:type="dxa"/>
+              <w:right w:w="80" w:type="dxa"/>
+            </w:tcMar>
+          </w:tcPr>
+          <w:p>
+            <w:r>
+              <w:rPr>
+                <w:rFonts w:ascii="Arial" w:hAnsi="Arial"/>
+                <w:b w:val="0"/>
+                <w:i w:val="0"/>
+                <w:sz w:val="20"/>
+              </w:rPr>
+              <w:t>Ampicillin</w:t>
+            </w:r>
+          </w:p>
+        </w:tc>
+        <w:tc>
+          <w:tcPr>
+            <w:tcW w:type="dxa" w:w="3798"/>
+            <w:shd w:val="clear" w:color="auto" w:fill="D6E4F0"/>
+            <w:tcBorders>
+              <w:top w:val="single" w:sz="4" w:space="0" w:color="AAAAAA"/>
+              <w:left w:val="single" w:sz="4" w:space="0" w:color="AAAAAA"/>
+              <w:bottom w:val="single" w:sz="4" w:space="0" w:color="AAAAAA"/>
+              <w:right w:val="single" w:sz="4" w:space="0" w:color="AAAAAA"/>
+            </w:tcBorders>
+            <w:tcMar>
+              <w:top w:w="80" w:type="dxa"/>
+              <w:left w:w="80" w:type="dxa"/>
+              <w:bottom w:w="80" w:type="dxa"/>
+              <w:right w:w="80" w:type="dxa"/>
+            </w:tcMar>
+          </w:tcPr>
+          <w:p>
+            <w:r>
+              <w:rPr>
+                <w:rFonts w:ascii="Arial" w:hAnsi="Arial"/>
+                <w:b w:val="0"/>
+                <w:i w:val="0"/>
+                <w:sz w:val="20"/>
+              </w:rPr>
+              <w:t>Benzylamine-derived cephem</w:t>
+            </w:r>
+          </w:p>
+        </w:tc>
+      </w:tr>
+      <w:tr>
+        <w:tc>
+          <w:tcPr>
+            <w:tcW w:type="dxa" w:w="680"/>
+            <w:shd w:val="clear" w:color="auto" w:fill="FFFFFF"/>
+            <w:tcBorders>
+              <w:top w:val="single" w:sz="4" w:space="0" w:color="AAAAAA"/>
+              <w:left w:val="single" w:sz="4" w:space="0" w:color="AAAAAA"/>
+              <w:bottom w:val="single" w:sz="4" w:space="0" w:color="AAAAAA"/>
+              <w:right w:val="single" w:sz="4" w:space="0" w:color="AAAAAA"/>
+            </w:tcBorders>
+            <w:tcMar>
+              <w:top w:w="80" w:type="dxa"/>
+              <w:left w:w="80" w:type="dxa"/>
+              <w:bottom w:w="80" w:type="dxa"/>
+              <w:right w:w="80" w:type="dxa"/>
+            </w:tcMar>
+          </w:tcPr>
+          <w:p>
+            <w:r>
+              <w:rPr>
+                <w:rFonts w:ascii="Arial" w:hAnsi="Arial"/>
+                <w:b w:val="0"/>
+                <w:i w:val="0"/>
+                <w:sz w:val="20"/>
+              </w:rPr>
+              <w:t>29</w:t>
+            </w:r>
+          </w:p>
+        </w:tc>
+        <w:tc>
+          <w:tcPr>
+            <w:tcW w:type="dxa" w:w="1304"/>
+            <w:shd w:val="clear" w:color="auto" w:fill="FFFFFF"/>
+            <w:tcBorders>
+              <w:top w:val="single" w:sz="4" w:space="0" w:color="AAAAAA"/>
+              <w:left w:val="single" w:sz="4" w:space="0" w:color="AAAAAA"/>
+              <w:bottom w:val="single" w:sz="4" w:space="0" w:color="AAAAAA"/>
+              <w:right w:val="single" w:sz="4" w:space="0" w:color="AAAAAA"/>
+            </w:tcBorders>
+            <w:tcMar>
+              <w:top w:w="80" w:type="dxa"/>
+              <w:left w:w="80" w:type="dxa"/>
+              <w:bottom w:w="80" w:type="dxa"/>
+              <w:right w:w="80" w:type="dxa"/>
+            </w:tcMar>
+          </w:tcPr>
+          <w:p>
+            <w:r>
+              <w:rPr>
+                <w:rFonts w:ascii="Arial" w:hAnsi="Arial"/>
+                <w:b w:val="0"/>
+                <w:i w:val="0"/>
+                <w:sz w:val="20"/>
+              </w:rPr>
+              <w:t>0.170</w:t>
+            </w:r>
+          </w:p>
+        </w:tc>
+        <w:tc>
+          <w:tcPr>
+            <w:tcW w:type="dxa" w:w="1304"/>
+            <w:shd w:val="clear" w:color="auto" w:fill="FFFFFF"/>
+            <w:tcBorders>
+              <w:top w:val="single" w:sz="4" w:space="0" w:color="AAAAAA"/>
+              <w:left w:val="single" w:sz="4" w:space="0" w:color="AAAAAA"/>
+              <w:bottom w:val="single" w:sz="4" w:space="0" w:color="AAAAAA"/>
+              <w:right w:val="single" w:sz="4" w:space="0" w:color="AAAAAA"/>
+            </w:tcBorders>
+            <w:tcMar>
+              <w:top w:w="80" w:type="dxa"/>
+              <w:left w:w="80" w:type="dxa"/>
+              <w:bottom w:w="80" w:type="dxa"/>
+              <w:right w:w="80" w:type="dxa"/>
+            </w:tcMar>
+          </w:tcPr>
+          <w:p>
+            <w:r>
+              <w:rPr>
+                <w:rFonts w:ascii="Arial" w:hAnsi="Arial"/>
+                <w:b w:val="0"/>
+                <w:i w:val="0"/>
+                <w:sz w:val="20"/>
+              </w:rPr>
+              <w:t>0.227</w:t>
+            </w:r>
+          </w:p>
+        </w:tc>
+        <w:tc>
+          <w:tcPr>
+            <w:tcW w:type="dxa" w:w="1984"/>
+            <w:shd w:val="clear" w:color="auto" w:fill="FFFFFF"/>
+            <w:tcBorders>
+              <w:top w:val="single" w:sz="4" w:space="0" w:color="AAAAAA"/>
+              <w:left w:val="single" w:sz="4" w:space="0" w:color="AAAAAA"/>
+              <w:bottom w:val="single" w:sz="4" w:space="0" w:color="AAAAAA"/>
+              <w:right w:val="single" w:sz="4" w:space="0" w:color="AAAAAA"/>
+            </w:tcBorders>
+            <w:tcMar>
+              <w:top w:w="80" w:type="dxa"/>
+              <w:left w:w="80" w:type="dxa"/>
+              <w:bottom w:w="80" w:type="dxa"/>
+              <w:right w:w="80" w:type="dxa"/>
+            </w:tcMar>
+          </w:tcPr>
+          <w:p>
+            <w:r>
+              <w:rPr>
+                <w:rFonts w:ascii="Arial" w:hAnsi="Arial"/>
+                <w:b w:val="0"/>
+                <w:i w:val="0"/>
+                <w:sz w:val="20"/>
+              </w:rPr>
+              <w:t>Rifampicin</w:t>
+            </w:r>
+          </w:p>
+        </w:tc>
+        <w:tc>
+          <w:tcPr>
+            <w:tcW w:type="dxa" w:w="3798"/>
+            <w:shd w:val="clear" w:color="auto" w:fill="FFFFFF"/>
+            <w:tcBorders>
+              <w:top w:val="single" w:sz="4" w:space="0" w:color="AAAAAA"/>
+              <w:left w:val="single" w:sz="4" w:space="0" w:color="AAAAAA"/>
+              <w:bottom w:val="single" w:sz="4" w:space="0" w:color="AAAAAA"/>
+              <w:right w:val="single" w:sz="4" w:space="0" w:color="AAAAAA"/>
+            </w:tcBorders>
+            <w:tcMar>
+              <w:top w:w="80" w:type="dxa"/>
+              <w:left w:w="80" w:type="dxa"/>
+              <w:bottom w:w="80" w:type="dxa"/>
+              <w:right w:w="80" w:type="dxa"/>
+            </w:tcMar>
+          </w:tcPr>
+          <w:p>
+            <w:r>
+              <w:rPr>
+                <w:rFonts w:ascii="Arial" w:hAnsi="Arial"/>
+                <w:b w:val="0"/>
+                <w:i w:val="0"/>
+                <w:sz w:val="20"/>
+              </w:rPr>
+              <w:t>Rifamycin-adjacent but structurally distinct</w:t>
+            </w:r>
+          </w:p>
+        </w:tc>
+      </w:tr>
+      <w:tr>
+        <w:tc>
+          <w:tcPr>
+            <w:tcW w:type="dxa" w:w="680"/>
+            <w:shd w:val="clear" w:color="auto" w:fill="D6E4F0"/>
+            <w:tcBorders>
+              <w:top w:val="single" w:sz="4" w:space="0" w:color="AAAAAA"/>
+              <w:left w:val="single" w:sz="4" w:space="0" w:color="AAAAAA"/>
+              <w:bottom w:val="single" w:sz="4" w:space="0" w:color="AAAAAA"/>
+              <w:right w:val="single" w:sz="4" w:space="0" w:color="AAAAAA"/>
+            </w:tcBorders>
+            <w:tcMar>
+              <w:top w:w="80" w:type="dxa"/>
+              <w:left w:w="80" w:type="dxa"/>
+              <w:bottom w:w="80" w:type="dxa"/>
+              <w:right w:w="80" w:type="dxa"/>
+            </w:tcMar>
+          </w:tcPr>
+          <w:p>
+            <w:r>
+              <w:rPr>
+                <w:rFonts w:ascii="Arial" w:hAnsi="Arial"/>
+                <w:b w:val="0"/>
+                <w:i w:val="0"/>
+                <w:sz w:val="20"/>
+              </w:rPr>
+              <w:t>36</w:t>
+            </w:r>
+          </w:p>
+        </w:tc>
+        <w:tc>
+          <w:tcPr>
+            <w:tcW w:type="dxa" w:w="1304"/>
+            <w:shd w:val="clear" w:color="auto" w:fill="D6E4F0"/>
+            <w:tcBorders>
+              <w:top w:val="single" w:sz="4" w:space="0" w:color="AAAAAA"/>
+              <w:left w:val="single" w:sz="4" w:space="0" w:color="AAAAAA"/>
+              <w:bottom w:val="single" w:sz="4" w:space="0" w:color="AAAAAA"/>
+              <w:right w:val="single" w:sz="4" w:space="0" w:color="AAAAAA"/>
+            </w:tcBorders>
+            <w:tcMar>
+              <w:top w:w="80" w:type="dxa"/>
+              <w:left w:w="80" w:type="dxa"/>
+              <w:bottom w:w="80" w:type="dxa"/>
+              <w:right w:w="80" w:type="dxa"/>
+            </w:tcMar>
+          </w:tcPr>
+          <w:p>
+            <w:r>
+              <w:rPr>
+                <w:rFonts w:ascii="Arial" w:hAnsi="Arial"/>
+                <w:b w:val="0"/>
+                <w:i w:val="0"/>
+                <w:sz w:val="20"/>
+              </w:rPr>
+              <w:t>0.075</w:t>
+            </w:r>
+          </w:p>
+        </w:tc>
+        <w:tc>
+          <w:tcPr>
+            <w:tcW w:type="dxa" w:w="1304"/>
+            <w:shd w:val="clear" w:color="auto" w:fill="D6E4F0"/>
+            <w:tcBorders>
+              <w:top w:val="single" w:sz="4" w:space="0" w:color="AAAAAA"/>
+              <w:left w:val="single" w:sz="4" w:space="0" w:color="AAAAAA"/>
+              <w:bottom w:val="single" w:sz="4" w:space="0" w:color="AAAAAA"/>
+              <w:right w:val="single" w:sz="4" w:space="0" w:color="AAAAAA"/>
+            </w:tcBorders>
+            <w:tcMar>
+              <w:top w:w="80" w:type="dxa"/>
+              <w:left w:w="80" w:type="dxa"/>
+              <w:bottom w:w="80" w:type="dxa"/>
+              <w:right w:w="80" w:type="dxa"/>
+            </w:tcMar>
+          </w:tcPr>
+          <w:p>
+            <w:r>
+              <w:rPr>
+                <w:rFonts w:ascii="Arial" w:hAnsi="Arial"/>
+                <w:b w:val="0"/>
+                <w:i w:val="0"/>
+                <w:sz w:val="20"/>
+              </w:rPr>
+              <w:t>0.281</w:t>
+            </w:r>
+          </w:p>
+        </w:tc>
+        <w:tc>
+          <w:tcPr>
+            <w:tcW w:type="dxa" w:w="1984"/>
+            <w:shd w:val="clear" w:color="auto" w:fill="D6E4F0"/>
+            <w:tcBorders>
+              <w:top w:val="single" w:sz="4" w:space="0" w:color="AAAAAA"/>
+              <w:left w:val="single" w:sz="4" w:space="0" w:color="AAAAAA"/>
+              <w:bottom w:val="single" w:sz="4" w:space="0" w:color="AAAAAA"/>
+              <w:right w:val="single" w:sz="4" w:space="0" w:color="AAAAAA"/>
+            </w:tcBorders>
+            <w:tcMar>
+              <w:top w:w="80" w:type="dxa"/>
+              <w:left w:w="80" w:type="dxa"/>
+              <w:bottom w:w="80" w:type="dxa"/>
+              <w:right w:w="80" w:type="dxa"/>
+            </w:tcMar>
+          </w:tcPr>
+          <w:p>
+            <w:r>
+              <w:rPr>
+                <w:rFonts w:ascii="Arial" w:hAnsi="Arial"/>
+                <w:b w:val="0"/>
+                <w:i w:val="0"/>
+                <w:sz w:val="20"/>
+              </w:rPr>
+              <w:t>Erythromycin</w:t>
+            </w:r>
+          </w:p>
+        </w:tc>
+        <w:tc>
+          <w:tcPr>
+            <w:tcW w:type="dxa" w:w="3798"/>
+            <w:shd w:val="clear" w:color="auto" w:fill="D6E4F0"/>
+            <w:tcBorders>
+              <w:top w:val="single" w:sz="4" w:space="0" w:color="AAAAAA"/>
+              <w:left w:val="single" w:sz="4" w:space="0" w:color="AAAAAA"/>
+              <w:bottom w:val="single" w:sz="4" w:space="0" w:color="AAAAAA"/>
+              <w:right w:val="single" w:sz="4" w:space="0" w:color="AAAAAA"/>
+            </w:tcBorders>
+            <w:tcMar>
+              <w:top w:w="80" w:type="dxa"/>
+              <w:left w:w="80" w:type="dxa"/>
+              <w:bottom w:w="80" w:type="dxa"/>
+              <w:right w:w="80" w:type="dxa"/>
+            </w:tcMar>
+          </w:tcPr>
+          <w:p>
+            <w:r>
+              <w:rPr>
+                <w:rFonts w:ascii="Arial" w:hAnsi="Arial"/>
+                <w:b w:val="0"/>
+                <w:i w:val="0"/>
+                <w:sz w:val="20"/>
+              </w:rPr>
+              <w:t>Macrolide-adjacent; lower confidence prediction</w:t>
+            </w:r>
+          </w:p>
+        </w:tc>
+      </w:tr>
+    </w:tbl>
+    <w:p>
+      <w:pPr>
+        <w:spacing w:after="80"/>
+      </w:pPr>
+    </w:p>
+    <w:p>
+      <w:pPr>
+        <w:spacing w:after="120"/>
+      </w:pPr>
+      <w:r>
+        <w:rPr>
+          <w:rFonts w:ascii="Arial" w:hAnsi="Arial"/>
+          <w:b w:val="0"/>
+          <w:i w:val="0"/>
+          <w:sz w:val="21"/>
+        </w:rPr>
+        <w:t>Most novel actives share a beta-lactam/cephem core with highly unusual side chains (tetrazoles, oxadiazoles, aminothiazoles, sulfonylmethyl groups). Tanimoto similarities to known beta-lactams range from 0.13 to 0.29, placing them firmly in the structurally novel category by drug discovery standards. Rank 9 (sim = 0.126) and Rank 3 (sim = 0.159) are the most structurally distant from any known antibiotic while remaining confirmed active compounds.</w:t>
+      </w:r>
+    </w:p>
+    <w:p>
+      <w:pPr>
+        <w:spacing w:before="120" w:after="80"/>
+        <w:jc w:val="center"/>
+      </w:pPr>
+      <w:r>
+        <w:drawing>
+          <wp:inline xmlns:a="http://schemas.openxmlformats.org/drawingml/2006/main" xmlns:pic="http://schemas.openxmlformats.org/drawingml/2006/picture">
+            <wp:extent cx="5760720" cy="2215662"/>
+            <wp:docPr id="7" name="Picture 7"/>
+            <wp:cNvGraphicFramePr>
+              <a:graphicFrameLocks noChangeAspect="1"/>
+            </wp:cNvGraphicFramePr>
+            <a:graphic>
+              <a:graphicData uri="http://schemas.openxmlformats.org/drawingml/2006/picture">
+                <pic:pic>
+                  <pic:nvPicPr>
+                    <pic:cNvPr id="0" name="tanimoto_novelty_top50.png"/>
+                    <pic:cNvPicPr/>
+                  </pic:nvPicPr>
+                  <pic:blipFill>
+                    <a:blip r:embed="rId14"/>
+                    <a:stretch>
+                      <a:fillRect/>
+                    </a:stretch>
+                  </pic:blipFill>
+                  <pic:spPr>
+                    <a:xfrm>
+                      <a:off x="0" y="0"/>
+                      <a:ext cx="5760720" cy="2215662"/>
+                    </a:xfrm>
+                    <a:prstGeom prst="rect"/>
+                  </pic:spPr>
+                </pic:pic>
+              </a:graphicData>
+            </a:graphic>
+          </wp:inline>
+        </w:drawing>
+      </w:r>
+    </w:p>
+    <w:p>
+      <w:pPr>
+        <w:spacing w:after="200"/>
+        <w:jc w:val="center"/>
+      </w:pPr>
+      <w:r>
+        <w:rPr>
+          <w:rFonts w:ascii="Arial" w:hAnsi="Arial"/>
+          <w:b w:val="0"/>
+          <w:i/>
+          <w:color w:val="595959"/>
+          <w:sz w:val="19"/>
+        </w:rPr>
+        <w:t>Figure 7. Left: Distribution of maximum Tanimoto similarity for top-50 predictions (green = structurally novel, orange = related scaffold). Most cluster well below 0.40. Right: Tanimoto vs rank (★ = true active). Novel true actives concentrate in the highest-ranked positions.</w:t>
+      </w:r>
+    </w:p>
+    <w:p>
+      <w:pPr>
+        <w:spacing w:before="120" w:after="80"/>
+        <w:jc w:val="center"/>
+      </w:pPr>
+      <w:r>
+        <w:drawing>
+          <wp:inline xmlns:a="http://schemas.openxmlformats.org/drawingml/2006/main" xmlns:pic="http://schemas.openxmlformats.org/drawingml/2006/picture">
+            <wp:extent cx="5760720" cy="3087913"/>
+            <wp:docPr id="8" name="Picture 8"/>
+            <wp:cNvGraphicFramePr>
+              <a:graphicFrameLocks noChangeAspect="1"/>
+            </wp:cNvGraphicFramePr>
+            <a:graphic>
+              <a:graphicData uri="http://schemas.openxmlformats.org/drawingml/2006/picture">
+                <pic:pic>
+                  <pic:nvPicPr>
+                    <pic:cNvPr id="0" name="tanimoto_heatmap_top20.png"/>
+                    <pic:cNvPicPr/>
+                  </pic:nvPicPr>
+                  <pic:blipFill>
+                    <a:blip r:embed="rId15"/>
+                    <a:stretch>
+                      <a:fillRect/>
+                    </a:stretch>
+                  </pic:blipFill>
+                  <pic:spPr>
+                    <a:xfrm>
+                      <a:off x="0" y="0"/>
+                      <a:ext cx="5760720" cy="3087913"/>
+                    </a:xfrm>
+                    <a:prstGeom prst="rect"/>
+                  </pic:spPr>
+                </pic:pic>
+              </a:graphicData>
+            </a:graphic>
+          </wp:inline>
+        </w:drawing>
+      </w:r>
+    </w:p>
+    <w:p>
+      <w:pPr>
+        <w:spacing w:after="200"/>
+        <w:jc w:val="center"/>
+      </w:pPr>
+      <w:r>
+        <w:rPr>
+          <w:rFonts w:ascii="Arial" w:hAnsi="Arial"/>
+          <w:b w:val="0"/>
+          <w:i/>
+          <w:color w:val="595959"/>
+          <w:sz w:val="19"/>
+        </w:rPr>
+        <w:t>Figure 8. Tanimoto similarity heatmap: top 20 predictions vs 19 reference antibiotics. Green left strip = structurally novel, orange = related scaffold. Most cells are pale yellow (low similarity), confirming broad structural novelty across the top predictions.</w:t>
+      </w:r>
+    </w:p>
+    <w:p>
+      <w:pPr>
+        <w:spacing w:after="80"/>
+      </w:pPr>
+    </w:p>
+    <w:p>
+      <w:pPr>
         <w:pBdr>
           <w:bottom w:val="single" w:sz="6" w:space="1" w:color="2E75B6"/>
         </w:pBdr>
@@ -7413,7 +10206,7 @@
           <w:color w:val="2E75B6"/>
           <w:sz w:val="28"/>
         </w:rPr>
-        <w:t>9. Summary of All Findings</w:t>
+        <w:t>10. Summary of All Findings</w:t>
       </w:r>
     </w:p>
     <w:tbl>
@@ -7734,7 +10527,7 @@
                 <w:rFonts w:ascii="Arial" w:hAnsi="Arial"/>
                 <w:sz w:val="20"/>
               </w:rPr>
-              <w:t>Which top predictions can enter E. coli (supervisor's question)?</w:t>
+              <w:t>Which top predictions can enter E. coli?</w:t>
             </w:r>
           </w:p>
         </w:tc>
@@ -7842,7 +10635,7 @@
           <w:color w:val="2E75B6"/>
           <w:sz w:val="28"/>
         </w:rPr>
-        <w:t>10. Outputs</w:t>
+        <w:t>11. Outputs</w:t>
       </w:r>
     </w:p>
     <w:tbl>
@@ -8640,6 +11433,306 @@
                 <w:sz w:val="20"/>
               </w:rPr>
               <w:t>Cumulative precision and eNTRy pass rate vs rank</w:t>
+            </w:r>
+          </w:p>
+        </w:tc>
+      </w:tr>
+      <w:tr>
+        <w:tc>
+          <w:tcPr>
+            <w:tcW w:type="dxa" w:w="4252"/>
+            <w:shd w:val="clear" w:color="auto" w:fill="FFFFFF"/>
+            <w:tcBorders>
+              <w:top w:val="single" w:sz="4" w:space="0" w:color="AAAAAA"/>
+              <w:left w:val="single" w:sz="4" w:space="0" w:color="AAAAAA"/>
+              <w:bottom w:val="single" w:sz="4" w:space="0" w:color="AAAAAA"/>
+              <w:right w:val="single" w:sz="4" w:space="0" w:color="AAAAAA"/>
+            </w:tcBorders>
+            <w:tcMar>
+              <w:top w:w="80" w:type="dxa"/>
+              <w:left w:w="80" w:type="dxa"/>
+              <w:bottom w:w="80" w:type="dxa"/>
+              <w:right w:w="80" w:type="dxa"/>
+            </w:tcMar>
+          </w:tcPr>
+          <w:p>
+            <w:r>
+              <w:rPr>
+                <w:rFonts w:ascii="Arial" w:hAnsi="Arial"/>
+                <w:b w:val="0"/>
+                <w:i w:val="0"/>
+                <w:sz w:val="20"/>
+              </w:rPr>
+              <w:t>results_phase6/results_phase6d.json</w:t>
+            </w:r>
+          </w:p>
+        </w:tc>
+        <w:tc>
+          <w:tcPr>
+            <w:tcW w:type="dxa" w:w="4819"/>
+            <w:shd w:val="clear" w:color="auto" w:fill="FFFFFF"/>
+            <w:tcBorders>
+              <w:top w:val="single" w:sz="4" w:space="0" w:color="AAAAAA"/>
+              <w:left w:val="single" w:sz="4" w:space="0" w:color="AAAAAA"/>
+              <w:bottom w:val="single" w:sz="4" w:space="0" w:color="AAAAAA"/>
+              <w:right w:val="single" w:sz="4" w:space="0" w:color="AAAAAA"/>
+            </w:tcBorders>
+            <w:tcMar>
+              <w:top w:w="80" w:type="dxa"/>
+              <w:left w:w="80" w:type="dxa"/>
+              <w:bottom w:w="80" w:type="dxa"/>
+              <w:right w:w="80" w:type="dxa"/>
+            </w:tcMar>
+          </w:tcPr>
+          <w:p>
+            <w:r>
+              <w:rPr>
+                <w:rFonts w:ascii="Arial" w:hAnsi="Arial"/>
+                <w:b w:val="0"/>
+                <w:i w:val="0"/>
+                <w:sz w:val="20"/>
+              </w:rPr>
+              <w:t>Structural novelty summary (top-50 predictions vs 19 reference antibiotics)</w:t>
+            </w:r>
+          </w:p>
+        </w:tc>
+      </w:tr>
+      <w:tr>
+        <w:tc>
+          <w:tcPr>
+            <w:tcW w:type="dxa" w:w="4252"/>
+            <w:shd w:val="clear" w:color="auto" w:fill="D6E4F0"/>
+            <w:tcBorders>
+              <w:top w:val="single" w:sz="4" w:space="0" w:color="AAAAAA"/>
+              <w:left w:val="single" w:sz="4" w:space="0" w:color="AAAAAA"/>
+              <w:bottom w:val="single" w:sz="4" w:space="0" w:color="AAAAAA"/>
+              <w:right w:val="single" w:sz="4" w:space="0" w:color="AAAAAA"/>
+            </w:tcBorders>
+            <w:tcMar>
+              <w:top w:w="80" w:type="dxa"/>
+              <w:left w:w="80" w:type="dxa"/>
+              <w:bottom w:w="80" w:type="dxa"/>
+              <w:right w:w="80" w:type="dxa"/>
+            </w:tcMar>
+          </w:tcPr>
+          <w:p>
+            <w:r>
+              <w:rPr>
+                <w:rFonts w:ascii="Arial" w:hAnsi="Arial"/>
+                <w:b w:val="0"/>
+                <w:i w:val="0"/>
+                <w:sz w:val="20"/>
+              </w:rPr>
+              <w:t>results_phase6/novel_candidates.csv</w:t>
+            </w:r>
+          </w:p>
+        </w:tc>
+        <w:tc>
+          <w:tcPr>
+            <w:tcW w:type="dxa" w:w="4819"/>
+            <w:shd w:val="clear" w:color="auto" w:fill="D6E4F0"/>
+            <w:tcBorders>
+              <w:top w:val="single" w:sz="4" w:space="0" w:color="AAAAAA"/>
+              <w:left w:val="single" w:sz="4" w:space="0" w:color="AAAAAA"/>
+              <w:bottom w:val="single" w:sz="4" w:space="0" w:color="AAAAAA"/>
+              <w:right w:val="single" w:sz="4" w:space="0" w:color="AAAAAA"/>
+            </w:tcBorders>
+            <w:tcMar>
+              <w:top w:w="80" w:type="dxa"/>
+              <w:left w:w="80" w:type="dxa"/>
+              <w:bottom w:w="80" w:type="dxa"/>
+              <w:right w:w="80" w:type="dxa"/>
+            </w:tcMar>
+          </w:tcPr>
+          <w:p>
+            <w:r>
+              <w:rPr>
+                <w:rFonts w:ascii="Arial" w:hAnsi="Arial"/>
+                <w:b w:val="0"/>
+                <w:i w:val="0"/>
+                <w:sz w:val="20"/>
+              </w:rPr>
+              <w:t>43 structurally novel top-50 predictions with Tanimoto scores</w:t>
+            </w:r>
+          </w:p>
+        </w:tc>
+      </w:tr>
+      <w:tr>
+        <w:tc>
+          <w:tcPr>
+            <w:tcW w:type="dxa" w:w="4252"/>
+            <w:shd w:val="clear" w:color="auto" w:fill="FFFFFF"/>
+            <w:tcBorders>
+              <w:top w:val="single" w:sz="4" w:space="0" w:color="AAAAAA"/>
+              <w:left w:val="single" w:sz="4" w:space="0" w:color="AAAAAA"/>
+              <w:bottom w:val="single" w:sz="4" w:space="0" w:color="AAAAAA"/>
+              <w:right w:val="single" w:sz="4" w:space="0" w:color="AAAAAA"/>
+            </w:tcBorders>
+            <w:tcMar>
+              <w:top w:w="80" w:type="dxa"/>
+              <w:left w:w="80" w:type="dxa"/>
+              <w:bottom w:w="80" w:type="dxa"/>
+              <w:right w:w="80" w:type="dxa"/>
+            </w:tcMar>
+          </w:tcPr>
+          <w:p>
+            <w:r>
+              <w:rPr>
+                <w:rFonts w:ascii="Arial" w:hAnsi="Arial"/>
+                <w:b w:val="0"/>
+                <w:i w:val="0"/>
+                <w:sz w:val="20"/>
+              </w:rPr>
+              <w:t>results_phase6/novelty_analysis_top50.csv</w:t>
+            </w:r>
+          </w:p>
+        </w:tc>
+        <w:tc>
+          <w:tcPr>
+            <w:tcW w:type="dxa" w:w="4819"/>
+            <w:shd w:val="clear" w:color="auto" w:fill="FFFFFF"/>
+            <w:tcBorders>
+              <w:top w:val="single" w:sz="4" w:space="0" w:color="AAAAAA"/>
+              <w:left w:val="single" w:sz="4" w:space="0" w:color="AAAAAA"/>
+              <w:bottom w:val="single" w:sz="4" w:space="0" w:color="AAAAAA"/>
+              <w:right w:val="single" w:sz="4" w:space="0" w:color="AAAAAA"/>
+            </w:tcBorders>
+            <w:tcMar>
+              <w:top w:w="80" w:type="dxa"/>
+              <w:left w:w="80" w:type="dxa"/>
+              <w:bottom w:w="80" w:type="dxa"/>
+              <w:right w:w="80" w:type="dxa"/>
+            </w:tcMar>
+          </w:tcPr>
+          <w:p>
+            <w:r>
+              <w:rPr>
+                <w:rFonts w:ascii="Arial" w:hAnsi="Arial"/>
+                <w:b w:val="0"/>
+                <w:i w:val="0"/>
+                <w:sz w:val="20"/>
+              </w:rPr>
+              <w:t>Full novelty table: all 50 predictions with most-similar antibiotic named</w:t>
+            </w:r>
+          </w:p>
+        </w:tc>
+      </w:tr>
+      <w:tr>
+        <w:tc>
+          <w:tcPr>
+            <w:tcW w:type="dxa" w:w="4252"/>
+            <w:shd w:val="clear" w:color="auto" w:fill="D6E4F0"/>
+            <w:tcBorders>
+              <w:top w:val="single" w:sz="4" w:space="0" w:color="AAAAAA"/>
+              <w:left w:val="single" w:sz="4" w:space="0" w:color="AAAAAA"/>
+              <w:bottom w:val="single" w:sz="4" w:space="0" w:color="AAAAAA"/>
+              <w:right w:val="single" w:sz="4" w:space="0" w:color="AAAAAA"/>
+            </w:tcBorders>
+            <w:tcMar>
+              <w:top w:w="80" w:type="dxa"/>
+              <w:left w:w="80" w:type="dxa"/>
+              <w:bottom w:w="80" w:type="dxa"/>
+              <w:right w:w="80" w:type="dxa"/>
+            </w:tcMar>
+          </w:tcPr>
+          <w:p>
+            <w:r>
+              <w:rPr>
+                <w:rFonts w:ascii="Arial" w:hAnsi="Arial"/>
+                <w:b w:val="0"/>
+                <w:i w:val="0"/>
+                <w:sz w:val="20"/>
+              </w:rPr>
+              <w:t>results_phase6/figures/tanimoto_novelty_top50.png</w:t>
+            </w:r>
+          </w:p>
+        </w:tc>
+        <w:tc>
+          <w:tcPr>
+            <w:tcW w:type="dxa" w:w="4819"/>
+            <w:shd w:val="clear" w:color="auto" w:fill="D6E4F0"/>
+            <w:tcBorders>
+              <w:top w:val="single" w:sz="4" w:space="0" w:color="AAAAAA"/>
+              <w:left w:val="single" w:sz="4" w:space="0" w:color="AAAAAA"/>
+              <w:bottom w:val="single" w:sz="4" w:space="0" w:color="AAAAAA"/>
+              <w:right w:val="single" w:sz="4" w:space="0" w:color="AAAAAA"/>
+            </w:tcBorders>
+            <w:tcMar>
+              <w:top w:w="80" w:type="dxa"/>
+              <w:left w:w="80" w:type="dxa"/>
+              <w:bottom w:w="80" w:type="dxa"/>
+              <w:right w:w="80" w:type="dxa"/>
+            </w:tcMar>
+          </w:tcPr>
+          <w:p>
+            <w:r>
+              <w:rPr>
+                <w:rFonts w:ascii="Arial" w:hAnsi="Arial"/>
+                <w:b w:val="0"/>
+                <w:i w:val="0"/>
+                <w:sz w:val="20"/>
+              </w:rPr>
+              <w:t>Structural novelty distribution and rank scatter plot</w:t>
+            </w:r>
+          </w:p>
+        </w:tc>
+      </w:tr>
+      <w:tr>
+        <w:tc>
+          <w:tcPr>
+            <w:tcW w:type="dxa" w:w="4252"/>
+            <w:shd w:val="clear" w:color="auto" w:fill="FFFFFF"/>
+            <w:tcBorders>
+              <w:top w:val="single" w:sz="4" w:space="0" w:color="AAAAAA"/>
+              <w:left w:val="single" w:sz="4" w:space="0" w:color="AAAAAA"/>
+              <w:bottom w:val="single" w:sz="4" w:space="0" w:color="AAAAAA"/>
+              <w:right w:val="single" w:sz="4" w:space="0" w:color="AAAAAA"/>
+            </w:tcBorders>
+            <w:tcMar>
+              <w:top w:w="80" w:type="dxa"/>
+              <w:left w:w="80" w:type="dxa"/>
+              <w:bottom w:w="80" w:type="dxa"/>
+              <w:right w:w="80" w:type="dxa"/>
+            </w:tcMar>
+          </w:tcPr>
+          <w:p>
+            <w:r>
+              <w:rPr>
+                <w:rFonts w:ascii="Arial" w:hAnsi="Arial"/>
+                <w:b w:val="0"/>
+                <w:i w:val="0"/>
+                <w:sz w:val="20"/>
+              </w:rPr>
+              <w:t>results_phase6/figures/tanimoto_heatmap_top20.png</w:t>
+            </w:r>
+          </w:p>
+        </w:tc>
+        <w:tc>
+          <w:tcPr>
+            <w:tcW w:type="dxa" w:w="4819"/>
+            <w:shd w:val="clear" w:color="auto" w:fill="FFFFFF"/>
+            <w:tcBorders>
+              <w:top w:val="single" w:sz="4" w:space="0" w:color="AAAAAA"/>
+              <w:left w:val="single" w:sz="4" w:space="0" w:color="AAAAAA"/>
+              <w:bottom w:val="single" w:sz="4" w:space="0" w:color="AAAAAA"/>
+              <w:right w:val="single" w:sz="4" w:space="0" w:color="AAAAAA"/>
+            </w:tcBorders>
+            <w:tcMar>
+              <w:top w:w="80" w:type="dxa"/>
+              <w:left w:w="80" w:type="dxa"/>
+              <w:bottom w:w="80" w:type="dxa"/>
+              <w:right w:w="80" w:type="dxa"/>
+            </w:tcMar>
+          </w:tcPr>
+          <w:p>
+            <w:r>
+              <w:rPr>
+                <w:rFonts w:ascii="Arial" w:hAnsi="Arial"/>
+                <w:b w:val="0"/>
+                <w:i w:val="0"/>
+                <w:sz w:val="20"/>
+              </w:rPr>
+              <w:t>Tanimoto heatmap: top 20 predictions vs 19 reference antibiotics</w:t>
             </w:r>
           </w:p>
         </w:tc>
@@ -8664,7 +11757,7 @@
           <w:color w:val="2E75B6"/>
           <w:sz w:val="28"/>
         </w:rPr>
-        <w:t>11. Conclusion</w:t>
+        <w:t>12. Conclusion</w:t>
       </w:r>
     </w:p>
     <w:p>
@@ -8726,7 +11819,7 @@
           <w:rFonts w:ascii="Arial" w:hAnsi="Arial"/>
           <w:sz w:val="21"/>
         </w:rPr>
-        <w:t>The best model from Phase 5 (AUPRC = 0.646, P@10 = 0.90) remains the recommended model for compound prioritisation. Phase 6 adds a validated permeation descriptor pipeline and a biologically interpretable analysis confirming that the Stokes E. coli dataset captures a broader activity landscape than the eNTRy framework was designed for.</w:t>
+        <w:t>The best model from Phase 5 (AUPRC = 0.646, P@10 = 0.90) remains the recommended model for compound prioritisation. Phase 6 adds a validated permeation descriptor pipeline, a biologically interpretable analysis of the Stokes dataset activity landscape, and a structural novelty assessment confirming that the top model predictions are not rediscoveries of known antibiotics. The 11 structurally novel confirmed actives — particularly Rank 1 (prob = 0.999, max sim = 0.196) and Rank 9 (prob = 0.950, max sim = 0.126) — represent high-confidence predictions of antibacterially active compounds that are structurally non-redundant with the existing antibiotic landscape.</w:t>
       </w:r>
     </w:p>
     <w:p>

</xml_diff>